<commit_message>
fixing lecture 3 and html download
</commit_message>
<xml_diff>
--- a/docs/ecostats_lectures/lecture_03/03_01_lecture_powerpoint.docx
+++ b/docs/ecostats_lectures/lecture_03/03_01_lecture_powerpoint.docx
@@ -137,7 +137,11 @@
     </w:p>
     <w:p>
       <w:pPr>
-        <w:pStyle w:val="BodyText"/>
+        <w:pStyle w:val="Compact"/>
+        <w:numPr>
+          <w:ilvl w:val="0"/>
+          <w:numId w:val="1004"/>
+        </w:numPr>
       </w:pPr>
       <w:r>
         <w:t xml:space="preserve">TGW - yep its a thing</w:t>
@@ -145,7 +149,11 @@
     </w:p>
     <w:p>
       <w:pPr>
-        <w:pStyle w:val="BodyText"/>
+        <w:pStyle w:val="Compact"/>
+        <w:numPr>
+          <w:ilvl w:val="0"/>
+          <w:numId w:val="1004"/>
+        </w:numPr>
       </w:pPr>
       <w:r>
         <w:t xml:space="preserve">ODO - what do you think it is?</w:t>
@@ -153,21 +161,25 @@
     </w:p>
     <w:p>
       <w:pPr>
-        <w:pStyle w:val="BodyText"/>
-      </w:pPr>
-      <w:r>
-        <w:t xml:space="preserve">NO3 - what is it? Are you sure? Why might you get in legal trouble if</w:t>
-      </w:r>
-      <w:r>
-        <w:t xml:space="preserve"> </w:t>
-      </w:r>
-      <w:r>
-        <w:t xml:space="preserve">you used this?</w:t>
-      </w:r>
-    </w:p>
-    <w:p>
-      <w:pPr>
-        <w:pStyle w:val="BodyText"/>
+        <w:pStyle w:val="Compact"/>
+        <w:numPr>
+          <w:ilvl w:val="0"/>
+          <w:numId w:val="1004"/>
+        </w:numPr>
+      </w:pPr>
+      <w:r>
+        <w:t xml:space="preserve">NO3 - what is it? Are you sure? Why might you get in legal trouble</w:t>
+      </w:r>
+      <w:r>
+        <w:t xml:space="preserve"> </w:t>
+      </w:r>
+      <w:r>
+        <w:t xml:space="preserve">if you used this?</w:t>
+      </w:r>
+    </w:p>
+    <w:p>
+      <w:pPr>
+        <w:pStyle w:val="FirstParagraph"/>
       </w:pPr>
       <w:r>
         <w:drawing>
@@ -246,7 +258,7 @@
         <w:pStyle w:val="Compact"/>
         <w:numPr>
           <w:ilvl w:val="0"/>
-          <w:numId w:val="1004"/>
+          <w:numId w:val="1005"/>
         </w:numPr>
       </w:pPr>
       <w:r>
@@ -258,7 +270,7 @@
         <w:pStyle w:val="Compact"/>
         <w:numPr>
           <w:ilvl w:val="0"/>
-          <w:numId w:val="1004"/>
+          <w:numId w:val="1005"/>
         </w:numPr>
       </w:pPr>
       <w:r>
@@ -276,7 +288,7 @@
         <w:pStyle w:val="Compact"/>
         <w:numPr>
           <w:ilvl w:val="0"/>
-          <w:numId w:val="1004"/>
+          <w:numId w:val="1005"/>
         </w:numPr>
       </w:pPr>
       <w:r>
@@ -294,7 +306,7 @@
         <w:pStyle w:val="Compact"/>
         <w:numPr>
           <w:ilvl w:val="0"/>
-          <w:numId w:val="1004"/>
+          <w:numId w:val="1005"/>
         </w:numPr>
       </w:pPr>
       <w:r>
@@ -306,7 +318,7 @@
         <w:pStyle w:val="Compact"/>
         <w:numPr>
           <w:ilvl w:val="0"/>
-          <w:numId w:val="1004"/>
+          <w:numId w:val="1005"/>
         </w:numPr>
       </w:pPr>
       <w:r>
@@ -318,7 +330,7 @@
         <w:pStyle w:val="Compact"/>
         <w:numPr>
           <w:ilvl w:val="0"/>
-          <w:numId w:val="1004"/>
+          <w:numId w:val="1005"/>
         </w:numPr>
       </w:pPr>
       <w:r>
@@ -342,7 +354,10 @@
         <w:t xml:space="preserve">gray_I3_I8.csv</w:t>
       </w:r>
       <w:r>
-        <w:t xml:space="preserve">` from two different</w:t>
+        <w:t xml:space="preserve"> </w:t>
+      </w:r>
+      <w:r>
+        <w:t xml:space="preserve">from two different</w:t>
       </w:r>
       <w:r>
         <w:t xml:space="preserve"> </w:t>
@@ -406,7 +421,7 @@
       <w:r>
         <w:drawing>
           <wp:inline>
-            <wp:extent cx="2200275" cy="2819400"/>
+            <wp:extent cx="2943225" cy="4181475"/>
             <wp:effectExtent b="0" l="0" r="0" t="0"/>
             <wp:docPr descr="" title="" id="29" name="Picture"/>
             <a:graphic>
@@ -427,7 +442,7 @@
                   <pic:spPr bwMode="auto">
                     <a:xfrm>
                       <a:off x="0" y="0"/>
-                      <a:ext cx="2200275" cy="2819400"/>
+                      <a:ext cx="2943225" cy="4181475"/>
                     </a:xfrm>
                     <a:prstGeom prst="rect">
                       <a:avLst/>
@@ -447,13 +462,13 @@
       </w:r>
     </w:p>
     <w:bookmarkEnd w:id="31"/>
-    <w:bookmarkStart w:id="35" w:name="X62a4cda7abd44f2a2109df6f4e697e8308455a6"/>
+    <w:bookmarkStart w:id="34" w:name="lecture-3-populations-and-samples"/>
     <w:p>
       <w:pPr>
         <w:pStyle w:val="Heading1"/>
       </w:pPr>
       <w:r>
-        <w:t xml:space="preserve">Lecture 3: Why Statistics is Vital in Biology</w:t>
+        <w:t xml:space="preserve">Lecture 3: Populations and Samples</w:t>
       </w:r>
     </w:p>
     <w:p>
@@ -461,13 +476,13 @@
         <w:pStyle w:val="FirstParagraph"/>
       </w:pPr>
       <w:r>
-        <w:t xml:space="preserve">Biology is fundamentally different from fields like physics/chemistry in</w:t>
-      </w:r>
-      <w:r>
-        <w:t xml:space="preserve"> </w:t>
-      </w:r>
-      <w:r>
-        <w:t xml:space="preserve">that:</w:t>
+        <w:t xml:space="preserve">Before we dive into descriptive statistics, let’s clarify some</w:t>
+      </w:r>
+      <w:r>
+        <w:t xml:space="preserve"> </w:t>
+      </w:r>
+      <w:r>
+        <w:t xml:space="preserve">fundamental concepts:</w:t>
       </w:r>
     </w:p>
     <w:p>
@@ -475,55 +490,18 @@
         <w:pStyle w:val="Compact"/>
         <w:numPr>
           <w:ilvl w:val="0"/>
-          <w:numId w:val="1005"/>
+          <w:numId w:val="1006"/>
         </w:numPr>
       </w:pPr>
-      <w:r>
-        <w:t xml:space="preserve">Most biological phenomena are</w:t>
-      </w:r>
-      <w:r>
-        <w:t xml:space="preserve"> </w:t>
-      </w:r>
       <w:r>
         <w:rPr>
           <w:b/>
           <w:bCs/>
         </w:rPr>
-        <w:t xml:space="preserve">probabilistic</w:t>
-      </w:r>
-      <w:r>
-        <w:t xml:space="preserve"> </w:t>
-      </w:r>
-      <w:r>
-        <w:t xml:space="preserve">rather than</w:t>
-      </w:r>
-      <w:r>
-        <w:t xml:space="preserve"> </w:t>
-      </w:r>
-      <w:r>
-        <w:rPr>
-          <w:b/>
-          <w:bCs/>
-        </w:rPr>
-        <w:t xml:space="preserve">deterministic</w:t>
-      </w:r>
-    </w:p>
-    <w:p>
-      <w:pPr>
-        <w:pStyle w:val="Compact"/>
-        <w:numPr>
-          <w:ilvl w:val="1"/>
-          <w:numId w:val="1006"/>
-        </w:numPr>
-      </w:pPr>
-      <w:r>
-        <w:t xml:space="preserve">Responses occur with some characteristic probability, not with</w:t>
-      </w:r>
-      <w:r>
-        <w:t xml:space="preserve"> </w:t>
-      </w:r>
-      <w:r>
-        <w:t xml:space="preserve">certainty</w:t>
+        <w:t xml:space="preserve">Population</w:t>
+      </w:r>
+      <w:r>
+        <w:t xml:space="preserve">: entire group of things under consideration</w:t>
       </w:r>
     </w:p>
     <w:p>
@@ -531,53 +509,18 @@
         <w:pStyle w:val="Compact"/>
         <w:numPr>
           <w:ilvl w:val="0"/>
-          <w:numId w:val="1005"/>
+          <w:numId w:val="1006"/>
         </w:numPr>
       </w:pPr>
       <w:r>
-        <w:t xml:space="preserve">All biological material varies, which is essential for evolution</w:t>
-      </w:r>
-      <w:r>
-        <w:t xml:space="preserve"> </w:t>
-      </w:r>
-      <w:r>
-        <w:t xml:space="preserve">(recall Darwin’s postulates):</w:t>
-      </w:r>
-    </w:p>
-    <w:p>
-      <w:pPr>
-        <w:pStyle w:val="Compact"/>
-        <w:numPr>
-          <w:ilvl w:val="1"/>
-          <w:numId w:val="1007"/>
-        </w:numPr>
-      </w:pPr>
-      <w:r>
-        <w:t xml:space="preserve">Variation exists within populations</w:t>
-      </w:r>
-    </w:p>
-    <w:p>
-      <w:pPr>
-        <w:pStyle w:val="Compact"/>
-        <w:numPr>
-          <w:ilvl w:val="1"/>
-          <w:numId w:val="1007"/>
-        </w:numPr>
-      </w:pPr>
-      <w:r>
-        <w:t xml:space="preserve">Some variation is heritable</w:t>
-      </w:r>
-    </w:p>
-    <w:p>
-      <w:pPr>
-        <w:pStyle w:val="Compact"/>
-        <w:numPr>
-          <w:ilvl w:val="1"/>
-          <w:numId w:val="1007"/>
-        </w:numPr>
-      </w:pPr>
-      <w:r>
-        <w:t xml:space="preserve">Some heritable variation affects survival/reproduction</w:t>
+        <w:rPr>
+          <w:b/>
+          <w:bCs/>
+        </w:rPr>
+        <w:t xml:space="preserve">Sample</w:t>
+      </w:r>
+      <w:r>
+        <w:t xml:space="preserve">: A subset of the population that is actually measured</w:t>
       </w:r>
     </w:p>
     <w:p>
@@ -585,11 +528,26 @@
         <w:pStyle w:val="Compact"/>
         <w:numPr>
           <w:ilvl w:val="0"/>
-          <w:numId w:val="1005"/>
+          <w:numId w:val="1006"/>
         </w:numPr>
       </w:pPr>
       <w:r>
-        <w:t xml:space="preserve">Environmental conditions (in nature, lab, or greenhouse) always vary</w:t>
+        <w:rPr>
+          <w:b/>
+          <w:bCs/>
+        </w:rPr>
+        <w:t xml:space="preserve">Sample unit</w:t>
+      </w:r>
+      <w:r>
+        <w:t xml:space="preserve">: The individual thing drawn from the population</w:t>
+      </w:r>
+    </w:p>
+    <w:p>
+      <w:pPr>
+        <w:pStyle w:val="FirstParagraph"/>
+      </w:pPr>
+      <w:r>
+        <w:t xml:space="preserve">Types of populations:</w:t>
       </w:r>
     </w:p>
     <w:p>
@@ -597,11 +555,54 @@
         <w:pStyle w:val="Compact"/>
         <w:numPr>
           <w:ilvl w:val="0"/>
-          <w:numId w:val="1005"/>
+          <w:numId w:val="1007"/>
         </w:numPr>
       </w:pPr>
       <w:r>
-        <w:t xml:space="preserve">Measurements include error</w:t>
+        <w:rPr>
+          <w:b/>
+          <w:bCs/>
+        </w:rPr>
+        <w:t xml:space="preserve">Observational population</w:t>
+      </w:r>
+      <w:r>
+        <w:t xml:space="preserve">:</w:t>
+      </w:r>
+      <w:r>
+        <w:t xml:space="preserve"> </w:t>
+      </w:r>
+      <w:r>
+        <w:rPr>
+          <w:b/>
+          <w:bCs/>
+        </w:rPr>
+        <w:t xml:space="preserve">group whose characteristics are</w:t>
+      </w:r>
+      <w:r>
+        <w:rPr>
+          <w:b/>
+          <w:bCs/>
+        </w:rPr>
+        <w:t xml:space="preserve"> </w:t>
+      </w:r>
+      <w:r>
+        <w:rPr>
+          <w:b/>
+          <w:bCs/>
+        </w:rPr>
+        <w:t xml:space="preserve">studied passively</w:t>
+      </w:r>
+      <w:r>
+        <w:t xml:space="preserve"> </w:t>
+      </w:r>
+      <w:r>
+        <w:t xml:space="preserve">(e.g., head width of all corn earworms in a</w:t>
+      </w:r>
+      <w:r>
+        <w:t xml:space="preserve"> </w:t>
+      </w:r>
+      <w:r>
+        <w:t xml:space="preserve">field)</w:t>
       </w:r>
     </w:p>
     <w:p>
@@ -609,17 +610,62 @@
         <w:pStyle w:val="Compact"/>
         <w:numPr>
           <w:ilvl w:val="0"/>
-          <w:numId w:val="1005"/>
+          <w:numId w:val="1007"/>
         </w:numPr>
       </w:pPr>
       <w:r>
-        <w:t xml:space="preserve">Multiple unmeasured causal factors influence nearly all biological</w:t>
-      </w:r>
-      <w:r>
-        <w:t xml:space="preserve"> </w:t>
-      </w:r>
-      <w:r>
-        <w:t xml:space="preserve">systems</w:t>
+        <w:rPr>
+          <w:b/>
+          <w:bCs/>
+        </w:rPr>
+        <w:t xml:space="preserve">Experimental population</w:t>
+      </w:r>
+      <w:r>
+        <w:t xml:space="preserve">:</w:t>
+      </w:r>
+      <w:r>
+        <w:t xml:space="preserve"> </w:t>
+      </w:r>
+      <w:r>
+        <w:rPr>
+          <w:b/>
+          <w:bCs/>
+        </w:rPr>
+        <w:t xml:space="preserve">actively manipulate variables to</w:t>
+      </w:r>
+      <w:r>
+        <w:rPr>
+          <w:b/>
+          <w:bCs/>
+        </w:rPr>
+        <w:t xml:space="preserve"> </w:t>
+      </w:r>
+      <w:r>
+        <w:rPr>
+          <w:b/>
+          <w:bCs/>
+        </w:rPr>
+        <w:t xml:space="preserve">observe effects and establish cause-and-effect relationships</w:t>
+      </w:r>
+      <w:r>
+        <w:rPr>
+          <w:b/>
+          <w:bCs/>
+        </w:rPr>
+        <w:t xml:space="preserve"> </w:t>
+      </w:r>
+      <w:r>
+        <w:rPr>
+          <w:b/>
+          <w:bCs/>
+        </w:rPr>
+        <w:t xml:space="preserve">(e.g.,</w:t>
+      </w:r>
+      <w:r>
+        <w:t xml:space="preserve"> </w:t>
+      </w:r>
+      <w:r>
+        <w:t xml:space="preserve">manipulate temperature and monitor head width)</w:t>
       </w:r>
     </w:p>
     <w:p>
@@ -627,13 +673,7 @@
         <w:pStyle w:val="FirstParagraph"/>
       </w:pPr>
       <w:r>
-        <w:t xml:space="preserve">Statistics helps us understand biological processes in this variable</w:t>
-      </w:r>
-      <w:r>
-        <w:t xml:space="preserve"> </w:t>
-      </w:r>
-      <w:r>
-        <w:t xml:space="preserve">world by:</w:t>
+        <w:t xml:space="preserve">Sampling involves</w:t>
       </w:r>
     </w:p>
     <w:p>
@@ -645,7 +685,23 @@
         </w:numPr>
       </w:pPr>
       <w:r>
-        <w:t xml:space="preserve">Condensing variation into summary form (Descriptive statistics)</w:t>
+        <w:rPr>
+          <w:b/>
+          <w:bCs/>
+        </w:rPr>
+        <w:t xml:space="preserve">inference</w:t>
+      </w:r>
+      <w:r>
+        <w:t xml:space="preserve"> </w:t>
+      </w:r>
+      <w:r>
+        <w:t xml:space="preserve">- generalizing from what is observed in the sample to</w:t>
+      </w:r>
+      <w:r>
+        <w:t xml:space="preserve"> </w:t>
+      </w:r>
+      <w:r>
+        <w:t xml:space="preserve">what is present in the population.</w:t>
       </w:r>
     </w:p>
     <w:p>
@@ -657,13 +713,20 @@
         </w:numPr>
       </w:pPr>
       <w:r>
-        <w:t xml:space="preserve">Testing whether observations are consistent with predictions</w:t>
-      </w:r>
-      <w:r>
-        <w:t xml:space="preserve"> </w:t>
-      </w:r>
-      <w:r>
-        <w:t xml:space="preserve">(Inferential statistics)</w:t>
+        <w:t xml:space="preserve">Valid inference requires</w:t>
+      </w:r>
+      <w:r>
+        <w:t xml:space="preserve"> </w:t>
+      </w:r>
+      <w:r>
+        <w:rPr>
+          <w:b/>
+          <w:bCs/>
+        </w:rPr>
+        <w:t xml:space="preserve">random sampling</w:t>
+      </w:r>
+      <w:r>
+        <w:t xml:space="preserve">.</w:t>
       </w:r>
     </w:p>
     <w:p>
@@ -673,20 +736,722 @@
       <w:r>
         <w:drawing>
           <wp:inline>
-            <wp:extent cx="2743200" cy="2743200"/>
+            <wp:extent cx="3086100" cy="4114800"/>
             <wp:effectExtent b="0" l="0" r="0" t="0"/>
-            <wp:docPr descr="" title="" id="33" name="Picture"/>
+            <wp:docPr descr="" title="" id="32" name="Picture"/>
             <a:graphic>
               <a:graphicData uri="http://schemas.openxmlformats.org/drawingml/2006/picture">
                 <pic:pic>
                   <pic:nvPicPr>
-                    <pic:cNvPr descr="03_01_lecture_powerpoint_files/figure-docx/unnamed-chunk-1-1.png" id="34" name="Picture"/>
+                    <pic:cNvPr descr="images/pop_sample_stats.png" id="33" name="Picture"/>
                     <pic:cNvPicPr>
                       <a:picLocks noChangeArrowheads="1" noChangeAspect="1"/>
                     </pic:cNvPicPr>
                   </pic:nvPicPr>
                   <pic:blipFill>
-                    <a:blip r:embed="rId32"/>
+                    <a:blip r:embed="rId28"/>
+                    <a:stretch>
+                      <a:fillRect/>
+                    </a:stretch>
+                  </pic:blipFill>
+                  <pic:spPr bwMode="auto">
+                    <a:xfrm>
+                      <a:off x="0" y="0"/>
+                      <a:ext cx="3086100" cy="4114800"/>
+                    </a:xfrm>
+                    <a:prstGeom prst="rect">
+                      <a:avLst/>
+                    </a:prstGeom>
+                    <a:noFill/>
+                    <a:ln w="9525">
+                      <a:noFill/>
+                      <a:headEnd/>
+                      <a:tailEnd/>
+                    </a:ln>
+                  </pic:spPr>
+                </pic:pic>
+              </a:graphicData>
+            </a:graphic>
+          </wp:inline>
+        </w:drawing>
+      </w:r>
+    </w:p>
+    <w:bookmarkEnd w:id="34"/>
+    <w:bookmarkStart w:id="37" w:name="lecture-3-parameters-vs.-statistics"/>
+    <w:p>
+      <w:pPr>
+        <w:pStyle w:val="Heading1"/>
+      </w:pPr>
+      <w:r>
+        <w:t xml:space="preserve">Lecture 3: Parameters vs. Statistics</w:t>
+      </w:r>
+    </w:p>
+    <w:p>
+      <w:pPr>
+        <w:pStyle w:val="FirstParagraph"/>
+      </w:pPr>
+      <w:r>
+        <w:t xml:space="preserve">It’s important to distinguish between:</w:t>
+      </w:r>
+    </w:p>
+    <w:p>
+      <w:pPr>
+        <w:pStyle w:val="Compact"/>
+        <w:numPr>
+          <w:ilvl w:val="0"/>
+          <w:numId w:val="1009"/>
+        </w:numPr>
+      </w:pPr>
+      <w:r>
+        <w:rPr>
+          <w:b/>
+          <w:bCs/>
+        </w:rPr>
+        <w:t xml:space="preserve">Parameters</w:t>
+      </w:r>
+      <w:r>
+        <w:t xml:space="preserve">: True numerical values for a population (usually</w:t>
+      </w:r>
+      <w:r>
+        <w:t xml:space="preserve"> </w:t>
+      </w:r>
+      <w:r>
+        <w:t xml:space="preserve">denoted by Greek letters)</w:t>
+      </w:r>
+    </w:p>
+    <w:p>
+      <w:pPr>
+        <w:pStyle w:val="Compact"/>
+        <w:numPr>
+          <w:ilvl w:val="0"/>
+          <w:numId w:val="1009"/>
+        </w:numPr>
+      </w:pPr>
+      <w:r>
+        <w:rPr>
+          <w:b/>
+          <w:bCs/>
+        </w:rPr>
+        <w:t xml:space="preserve">Statistics</w:t>
+      </w:r>
+      <w:r>
+        <w:t xml:space="preserve">: Estimates of parameters based on samples (usually</w:t>
+      </w:r>
+      <w:r>
+        <w:t xml:space="preserve"> </w:t>
+      </w:r>
+      <w:r>
+        <w:t xml:space="preserve">denoted by Roman letters)</w:t>
+      </w:r>
+    </w:p>
+    <w:p>
+      <w:pPr>
+        <w:pStyle w:val="FirstParagraph"/>
+      </w:pPr>
+      <w:r>
+        <w:t xml:space="preserve">For example:</w:t>
+      </w:r>
+    </w:p>
+    <w:p>
+      <w:pPr>
+        <w:pStyle w:val="Compact"/>
+        <w:numPr>
+          <w:ilvl w:val="0"/>
+          <w:numId w:val="1010"/>
+        </w:numPr>
+      </w:pPr>
+      <w:r>
+        <w:t xml:space="preserve">Population mean (μ) is estimated by sample mean (Y̅)</w:t>
+      </w:r>
+    </w:p>
+    <w:p>
+      <w:pPr>
+        <w:pStyle w:val="Compact"/>
+        <w:numPr>
+          <w:ilvl w:val="0"/>
+          <w:numId w:val="1010"/>
+        </w:numPr>
+      </w:pPr>
+      <w:r>
+        <w:t xml:space="preserve">Population standard deviation (σ) is estimated by sample standard</w:t>
+      </w:r>
+      <w:r>
+        <w:t xml:space="preserve"> </w:t>
+      </w:r>
+      <w:r>
+        <w:t xml:space="preserve">deviation (s)</w:t>
+      </w:r>
+    </w:p>
+    <w:p>
+      <w:pPr>
+        <w:pStyle w:val="FirstParagraph"/>
+      </w:pPr>
+      <w:r>
+        <w:drawing>
+          <wp:inline>
+            <wp:extent cx="2952750" cy="3914775"/>
+            <wp:effectExtent b="0" l="0" r="0" t="0"/>
+            <wp:docPr descr="" title="" id="35" name="Picture"/>
+            <a:graphic>
+              <a:graphicData uri="http://schemas.openxmlformats.org/drawingml/2006/picture">
+                <pic:pic>
+                  <pic:nvPicPr>
+                    <pic:cNvPr descr="images/pop_sample_stats.png" id="36" name="Picture"/>
+                    <pic:cNvPicPr>
+                      <a:picLocks noChangeArrowheads="1" noChangeAspect="1"/>
+                    </pic:cNvPicPr>
+                  </pic:nvPicPr>
+                  <pic:blipFill>
+                    <a:blip r:embed="rId28"/>
+                    <a:stretch>
+                      <a:fillRect/>
+                    </a:stretch>
+                  </pic:blipFill>
+                  <pic:spPr bwMode="auto">
+                    <a:xfrm>
+                      <a:off x="0" y="0"/>
+                      <a:ext cx="2952750" cy="3914775"/>
+                    </a:xfrm>
+                    <a:prstGeom prst="rect">
+                      <a:avLst/>
+                    </a:prstGeom>
+                    <a:noFill/>
+                    <a:ln w="9525">
+                      <a:noFill/>
+                      <a:headEnd/>
+                      <a:tailEnd/>
+                    </a:ln>
+                  </pic:spPr>
+                </pic:pic>
+              </a:graphicData>
+            </a:graphic>
+          </wp:inline>
+        </w:drawing>
+      </w:r>
+    </w:p>
+    <w:bookmarkEnd w:id="37"/>
+    <w:bookmarkStart w:id="42" w:name="lecture-3-kinds-of-biological-variables"/>
+    <w:p>
+      <w:pPr>
+        <w:pStyle w:val="Heading1"/>
+      </w:pPr>
+      <w:r>
+        <w:t xml:space="preserve">Lecture 3: Kinds of Biological Variables</w:t>
+      </w:r>
+    </w:p>
+    <w:bookmarkStart w:id="38" w:name="X8312cc2d45c298857540977a296cd6032182a47"/>
+    <w:p>
+      <w:pPr>
+        <w:pStyle w:val="Heading3"/>
+      </w:pPr>
+      <w:r>
+        <w:t xml:space="preserve">Understanding the type of variable you’re working with is essential for selecting appropriate statistics:</w:t>
+      </w:r>
+    </w:p>
+    <w:bookmarkEnd w:id="38"/>
+    <w:bookmarkStart w:id="39" w:name="measurement-or-quantitative-variables"/>
+    <w:p>
+      <w:pPr>
+        <w:pStyle w:val="Heading3"/>
+      </w:pPr>
+      <w:r>
+        <w:t xml:space="preserve">Measurement or Quantitative Variables</w:t>
+      </w:r>
+    </w:p>
+    <w:p>
+      <w:pPr>
+        <w:pStyle w:val="Compact"/>
+        <w:numPr>
+          <w:ilvl w:val="0"/>
+          <w:numId w:val="1011"/>
+        </w:numPr>
+      </w:pPr>
+      <w:r>
+        <w:rPr>
+          <w:b/>
+          <w:bCs/>
+        </w:rPr>
+        <w:t xml:space="preserve">Continuous</w:t>
+      </w:r>
+      <w:r>
+        <w:t xml:space="preserve">: Any value between extremes of scale is possible</w:t>
+      </w:r>
+      <w:r>
+        <w:t xml:space="preserve"> </w:t>
+      </w:r>
+      <w:r>
+        <w:t xml:space="preserve">(e.g., mass, length)</w:t>
+      </w:r>
+    </w:p>
+    <w:p>
+      <w:pPr>
+        <w:pStyle w:val="Compact"/>
+        <w:numPr>
+          <w:ilvl w:val="0"/>
+          <w:numId w:val="1011"/>
+        </w:numPr>
+      </w:pPr>
+      <w:r>
+        <w:rPr>
+          <w:b/>
+          <w:bCs/>
+        </w:rPr>
+        <w:t xml:space="preserve">Discrete (meristic)</w:t>
+      </w:r>
+      <w:r>
+        <w:t xml:space="preserve">: Only fixed values (usually integers)</w:t>
+      </w:r>
+      <w:r>
+        <w:t xml:space="preserve"> </w:t>
+      </w:r>
+      <w:r>
+        <w:t xml:space="preserve">between extremes are possible (e.g., bristle number, egg count)</w:t>
+      </w:r>
+    </w:p>
+    <w:bookmarkEnd w:id="39"/>
+    <w:bookmarkStart w:id="40" w:name="rank-variables-ordinal"/>
+    <w:p>
+      <w:pPr>
+        <w:pStyle w:val="Heading3"/>
+      </w:pPr>
+      <w:r>
+        <w:t xml:space="preserve">Rank Variables (Ordinal)</w:t>
+      </w:r>
+    </w:p>
+    <w:p>
+      <w:pPr>
+        <w:pStyle w:val="Compact"/>
+        <w:numPr>
+          <w:ilvl w:val="0"/>
+          <w:numId w:val="1012"/>
+        </w:numPr>
+      </w:pPr>
+      <w:r>
+        <w:t xml:space="preserve">Assign only order, not quantity - student rank - 1 2 3</w:t>
+      </w:r>
+    </w:p>
+    <w:p>
+      <w:pPr>
+        <w:pStyle w:val="Compact"/>
+        <w:numPr>
+          <w:ilvl w:val="0"/>
+          <w:numId w:val="1012"/>
+        </w:numPr>
+      </w:pPr>
+      <w:r>
+        <w:t xml:space="preserve">Nothing implied about relative distance between values</w:t>
+      </w:r>
+    </w:p>
+    <w:bookmarkEnd w:id="40"/>
+    <w:bookmarkStart w:id="41" w:name="categorical-variables-qualitative"/>
+    <w:p>
+      <w:pPr>
+        <w:pStyle w:val="Heading3"/>
+      </w:pPr>
+      <w:r>
+        <w:t xml:space="preserve">Categorical Variables (Qualitative)</w:t>
+      </w:r>
+    </w:p>
+    <w:p>
+      <w:pPr>
+        <w:pStyle w:val="Compact"/>
+        <w:numPr>
+          <w:ilvl w:val="0"/>
+          <w:numId w:val="1013"/>
+        </w:numPr>
+      </w:pPr>
+      <w:r>
+        <w:t xml:space="preserve">No quantitative information (e.g., male/female, living/dead)</w:t>
+      </w:r>
+    </w:p>
+    <w:p>
+      <w:pPr>
+        <w:pStyle w:val="Compact"/>
+        <w:numPr>
+          <w:ilvl w:val="0"/>
+          <w:numId w:val="1013"/>
+        </w:numPr>
+      </w:pPr>
+      <w:r>
+        <w:t xml:space="preserve">Some are simplifications of quantitative variables (e.g., color</w:t>
+      </w:r>
+      <w:r>
+        <w:t xml:space="preserve"> </w:t>
+      </w:r>
+      <w:r>
+        <w:t xml:space="preserve">instead of wavelength)</w:t>
+      </w:r>
+    </w:p>
+    <w:bookmarkEnd w:id="41"/>
+    <w:bookmarkEnd w:id="42"/>
+    <w:bookmarkStart w:id="44" w:name="lecture-3-derived-variables"/>
+    <w:p>
+      <w:pPr>
+        <w:pStyle w:val="Heading1"/>
+      </w:pPr>
+      <w:r>
+        <w:t xml:space="preserve">Lecture 3: Derived Variables</w:t>
+      </w:r>
+    </w:p>
+    <w:bookmarkStart w:id="43" w:name="derived-variables"/>
+    <w:p>
+      <w:pPr>
+        <w:pStyle w:val="Heading3"/>
+      </w:pPr>
+      <w:r>
+        <w:t xml:space="preserve">Derived Variables</w:t>
+      </w:r>
+    </w:p>
+    <w:p>
+      <w:pPr>
+        <w:pStyle w:val="Compact"/>
+        <w:numPr>
+          <w:ilvl w:val="0"/>
+          <w:numId w:val="1014"/>
+        </w:numPr>
+      </w:pPr>
+      <w:r>
+        <w:rPr>
+          <w:b/>
+          <w:bCs/>
+        </w:rPr>
+        <w:t xml:space="preserve">Percentages, Proportions</w:t>
+      </w:r>
+      <w:r>
+        <w:t xml:space="preserve">: Ratio of some component to total</w:t>
+      </w:r>
+    </w:p>
+    <w:p>
+      <w:pPr>
+        <w:pStyle w:val="Compact"/>
+        <w:numPr>
+          <w:ilvl w:val="0"/>
+          <w:numId w:val="1014"/>
+        </w:numPr>
+      </w:pPr>
+      <w:r>
+        <w:rPr>
+          <w:b/>
+          <w:bCs/>
+        </w:rPr>
+        <w:t xml:space="preserve">Ratios</w:t>
+      </w:r>
+      <w:r>
+        <w:t xml:space="preserve">: Relation of two variables</w:t>
+      </w:r>
+    </w:p>
+    <w:p>
+      <w:pPr>
+        <w:pStyle w:val="Compact"/>
+        <w:numPr>
+          <w:ilvl w:val="0"/>
+          <w:numId w:val="1014"/>
+        </w:numPr>
+      </w:pPr>
+      <w:r>
+        <w:rPr>
+          <w:b/>
+          <w:bCs/>
+        </w:rPr>
+        <w:t xml:space="preserve">Rates</w:t>
+      </w:r>
+      <w:r>
+        <w:t xml:space="preserve">: Quantity per unit (time, mass, etc.)</w:t>
+      </w:r>
+    </w:p>
+    <w:p>
+      <w:pPr>
+        <w:pStyle w:val="Compact"/>
+        <w:numPr>
+          <w:ilvl w:val="0"/>
+          <w:numId w:val="1014"/>
+        </w:numPr>
+      </w:pPr>
+      <w:r>
+        <w:rPr>
+          <w:b/>
+          <w:bCs/>
+        </w:rPr>
+        <w:t xml:space="preserve">Indices</w:t>
+      </w:r>
+      <w:r>
+        <w:t xml:space="preserve">: More complex derived variables (e.g., condition index)</w:t>
+      </w:r>
+    </w:p>
+    <w:p>
+      <w:pPr>
+        <w:pStyle w:val="FirstParagraph"/>
+      </w:pPr>
+      <w:r>
+        <w:t xml:space="preserve">Let’s explore our grayling dataset and identify the types of variables</w:t>
+      </w:r>
+      <w:r>
+        <w:t xml:space="preserve"> </w:t>
+      </w:r>
+      <w:r>
+        <w:t xml:space="preserve">it contains.</w:t>
+      </w:r>
+    </w:p>
+    <w:bookmarkEnd w:id="43"/>
+    <w:bookmarkEnd w:id="44"/>
+    <w:bookmarkStart w:id="48" w:name="X62a4cda7abd44f2a2109df6f4e697e8308455a6"/>
+    <w:p>
+      <w:pPr>
+        <w:pStyle w:val="Heading1"/>
+      </w:pPr>
+      <w:r>
+        <w:t xml:space="preserve">Lecture 3: Why Statistics is Vital in Biology</w:t>
+      </w:r>
+    </w:p>
+    <w:p>
+      <w:pPr>
+        <w:pStyle w:val="FirstParagraph"/>
+      </w:pPr>
+      <w:r>
+        <w:t xml:space="preserve">Biology is fundamentally different from fields like physics/chemistry in</w:t>
+      </w:r>
+      <w:r>
+        <w:t xml:space="preserve"> </w:t>
+      </w:r>
+      <w:r>
+        <w:t xml:space="preserve">that:</w:t>
+      </w:r>
+    </w:p>
+    <w:p>
+      <w:pPr>
+        <w:pStyle w:val="Compact"/>
+        <w:numPr>
+          <w:ilvl w:val="0"/>
+          <w:numId w:val="1015"/>
+        </w:numPr>
+      </w:pPr>
+      <w:r>
+        <w:t xml:space="preserve">Most biological phenomena are</w:t>
+      </w:r>
+      <w:r>
+        <w:t xml:space="preserve"> </w:t>
+      </w:r>
+      <w:r>
+        <w:rPr>
+          <w:b/>
+          <w:bCs/>
+        </w:rPr>
+        <w:t xml:space="preserve">probabilistic</w:t>
+      </w:r>
+      <w:r>
+        <w:t xml:space="preserve"> </w:t>
+      </w:r>
+      <w:r>
+        <w:t xml:space="preserve">rather than</w:t>
+      </w:r>
+      <w:r>
+        <w:t xml:space="preserve"> </w:t>
+      </w:r>
+      <w:r>
+        <w:rPr>
+          <w:b/>
+          <w:bCs/>
+        </w:rPr>
+        <w:t xml:space="preserve">deterministic</w:t>
+      </w:r>
+    </w:p>
+    <w:p>
+      <w:pPr>
+        <w:pStyle w:val="Compact"/>
+        <w:numPr>
+          <w:ilvl w:val="1"/>
+          <w:numId w:val="1016"/>
+        </w:numPr>
+      </w:pPr>
+      <w:r>
+        <w:t xml:space="preserve">Responses occur with some characteristic probability,</w:t>
+      </w:r>
+      <w:r>
+        <w:t xml:space="preserve"> </w:t>
+      </w:r>
+      <w:r>
+        <w:rPr>
+          <w:b/>
+          <w:bCs/>
+        </w:rPr>
+        <w:t xml:space="preserve">not with</w:t>
+      </w:r>
+      <w:r>
+        <w:rPr>
+          <w:b/>
+          <w:bCs/>
+        </w:rPr>
+        <w:t xml:space="preserve"> </w:t>
+      </w:r>
+      <w:r>
+        <w:rPr>
+          <w:b/>
+          <w:bCs/>
+        </w:rPr>
+        <w:t xml:space="preserve">certainty</w:t>
+      </w:r>
+    </w:p>
+    <w:p>
+      <w:pPr>
+        <w:pStyle w:val="Compact"/>
+        <w:numPr>
+          <w:ilvl w:val="0"/>
+          <w:numId w:val="1015"/>
+        </w:numPr>
+      </w:pPr>
+      <w:r>
+        <w:t xml:space="preserve">All biological material varies, which is essential for evolution</w:t>
+      </w:r>
+      <w:r>
+        <w:t xml:space="preserve"> </w:t>
+      </w:r>
+      <w:r>
+        <w:t xml:space="preserve">(recall Darwin’s postulates):</w:t>
+      </w:r>
+    </w:p>
+    <w:p>
+      <w:pPr>
+        <w:pStyle w:val="Compact"/>
+        <w:numPr>
+          <w:ilvl w:val="1"/>
+          <w:numId w:val="1017"/>
+        </w:numPr>
+      </w:pPr>
+      <w:r>
+        <w:t xml:space="preserve">Variation exists within populations</w:t>
+      </w:r>
+    </w:p>
+    <w:p>
+      <w:pPr>
+        <w:pStyle w:val="Compact"/>
+        <w:numPr>
+          <w:ilvl w:val="1"/>
+          <w:numId w:val="1017"/>
+        </w:numPr>
+      </w:pPr>
+      <w:r>
+        <w:t xml:space="preserve">Some variation is heritable</w:t>
+      </w:r>
+    </w:p>
+    <w:p>
+      <w:pPr>
+        <w:pStyle w:val="Compact"/>
+        <w:numPr>
+          <w:ilvl w:val="1"/>
+          <w:numId w:val="1017"/>
+        </w:numPr>
+      </w:pPr>
+      <w:r>
+        <w:t xml:space="preserve">Some heritable variation affects survival/reproduction</w:t>
+      </w:r>
+    </w:p>
+    <w:p>
+      <w:pPr>
+        <w:pStyle w:val="Compact"/>
+        <w:numPr>
+          <w:ilvl w:val="0"/>
+          <w:numId w:val="1015"/>
+        </w:numPr>
+      </w:pPr>
+      <w:r>
+        <w:t xml:space="preserve">Environmental conditions (in nature, lab, or greenhouse) always vary</w:t>
+      </w:r>
+    </w:p>
+    <w:p>
+      <w:pPr>
+        <w:pStyle w:val="Compact"/>
+        <w:numPr>
+          <w:ilvl w:val="0"/>
+          <w:numId w:val="1015"/>
+        </w:numPr>
+      </w:pPr>
+      <w:r>
+        <w:t xml:space="preserve">Measurements include error</w:t>
+      </w:r>
+    </w:p>
+    <w:p>
+      <w:pPr>
+        <w:pStyle w:val="Compact"/>
+        <w:numPr>
+          <w:ilvl w:val="0"/>
+          <w:numId w:val="1015"/>
+        </w:numPr>
+      </w:pPr>
+      <w:r>
+        <w:t xml:space="preserve">Multiple unmeasured causal factors influence nearly all biological</w:t>
+      </w:r>
+      <w:r>
+        <w:t xml:space="preserve"> </w:t>
+      </w:r>
+      <w:r>
+        <w:t xml:space="preserve">systems</w:t>
+      </w:r>
+    </w:p>
+    <w:p>
+      <w:pPr>
+        <w:pStyle w:val="FirstParagraph"/>
+      </w:pPr>
+      <w:r>
+        <w:t xml:space="preserve">Statistics helps us understand biological processes in this variable</w:t>
+      </w:r>
+      <w:r>
+        <w:t xml:space="preserve"> </w:t>
+      </w:r>
+      <w:r>
+        <w:t xml:space="preserve">world by:</w:t>
+      </w:r>
+    </w:p>
+    <w:p>
+      <w:pPr>
+        <w:pStyle w:val="Compact"/>
+        <w:numPr>
+          <w:ilvl w:val="0"/>
+          <w:numId w:val="1018"/>
+        </w:numPr>
+      </w:pPr>
+      <w:r>
+        <w:t xml:space="preserve">Condensing variation into summary form (Descriptive statistics)</w:t>
+      </w:r>
+    </w:p>
+    <w:p>
+      <w:pPr>
+        <w:pStyle w:val="Compact"/>
+        <w:numPr>
+          <w:ilvl w:val="0"/>
+          <w:numId w:val="1018"/>
+        </w:numPr>
+      </w:pPr>
+      <w:r>
+        <w:t xml:space="preserve">Testing whether observations are consistent with predictions</w:t>
+      </w:r>
+      <w:r>
+        <w:t xml:space="preserve"> </w:t>
+      </w:r>
+      <w:r>
+        <w:t xml:space="preserve">(Inferential statistics)</w:t>
+      </w:r>
+    </w:p>
+    <w:p>
+      <w:pPr>
+        <w:pStyle w:val="FirstParagraph"/>
+      </w:pPr>
+      <w:r>
+        <w:drawing>
+          <wp:inline>
+            <wp:extent cx="2743200" cy="2743200"/>
+            <wp:effectExtent b="0" l="0" r="0" t="0"/>
+            <wp:docPr descr="" title="" id="46" name="Picture"/>
+            <a:graphic>
+              <a:graphicData uri="http://schemas.openxmlformats.org/drawingml/2006/picture">
+                <pic:pic>
+                  <pic:nvPicPr>
+                    <pic:cNvPr descr="03_01_lecture_powerpoint_files/figure-docx/unnamed-chunk-1-1.png" id="47" name="Picture"/>
+                    <pic:cNvPicPr>
+                      <a:picLocks noChangeArrowheads="1" noChangeAspect="1"/>
+                    </pic:cNvPicPr>
+                  </pic:nvPicPr>
+                  <pic:blipFill>
+                    <a:blip r:embed="rId45"/>
                     <a:stretch>
                       <a:fillRect/>
                     </a:stretch>
@@ -713,8 +1478,8 @@
         </w:drawing>
       </w:r>
     </w:p>
-    <w:bookmarkEnd w:id="35"/>
-    <w:bookmarkStart w:id="39" w:name="practice-exercise-1-fish-data"/>
+    <w:bookmarkEnd w:id="48"/>
+    <w:bookmarkStart w:id="52" w:name="practice-exercise-1-fish-data"/>
     <w:p>
       <w:pPr>
         <w:pStyle w:val="Heading1"/>
@@ -765,18 +1530,18 @@
                 <wp:inline>
                   <wp:extent cx="152400" cy="152400"/>
                   <wp:effectExtent b="0" l="0" r="0" t="0"/>
-                  <wp:docPr descr="" title="" id="37" name="Picture"/>
+                  <wp:docPr descr="" title="" id="50" name="Picture"/>
                   <a:graphic>
                     <a:graphicData uri="http://schemas.openxmlformats.org/drawingml/2006/picture">
                       <pic:pic>
                         <pic:nvPicPr>
-                          <pic:cNvPr descr="/Applications/RStudio.app/Contents/Resources/app/quarto/share/formats/docx/tip.png" id="38" name="Picture"/>
+                          <pic:cNvPr descr="/Applications/RStudio.app/Contents/Resources/app/quarto/share/formats/docx/tip.png" id="51" name="Picture"/>
                           <pic:cNvPicPr>
                             <a:picLocks noChangeArrowheads="1" noChangeAspect="1"/>
                           </pic:cNvPicPr>
                         </pic:nvPicPr>
                         <pic:blipFill>
-                          <a:blip r:embed="rId36"/>
+                          <a:blip r:embed="rId49"/>
                           <a:stretch>
                             <a:fillRect/>
                           </a:stretch>
@@ -824,7 +1589,7 @@
               <w:t xml:space="preserve"> </w:t>
             </w:r>
             <w:r>
-              <w:t xml:space="preserve">and look at the structure and make a histogram?- see activity</w:t>
+              <w:t xml:space="preserve">and look at the structure and make a histogram?</w:t>
             </w:r>
           </w:p>
         </w:tc>
@@ -846,6 +1611,20 @@
             </w:pPr>
             <w:pPr>
               <w:spacing w:before="16"/>
+            </w:pPr>
+            <w:r>
+              <w:t xml:space="preserve">Note the variation around the mean… some could be due to measurement</w:t>
+            </w:r>
+            <w:r>
+              <w:t xml:space="preserve"> </w:t>
+            </w:r>
+            <w:r>
+              <w:t xml:space="preserve">error</w:t>
+            </w:r>
+          </w:p>
+          <w:p>
+            <w:pPr>
+              <w:pStyle w:val="BodyText"/>
             </w:pPr>
             <w:r>
               <w:t xml:space="preserve">Let’s recreate the basic histogram of fish lengths using</w:t>
@@ -883,708 +1662,6 @@
         </w:tc>
       </w:tr>
     </w:tbl>
-    <w:bookmarkEnd w:id="39"/>
-    <w:bookmarkStart w:id="42" w:name="lecture-3-populations-and-samples"/>
-    <w:p>
-      <w:pPr>
-        <w:pStyle w:val="Heading1"/>
-      </w:pPr>
-      <w:r>
-        <w:t xml:space="preserve">Lecture 3: Populations and Samples</w:t>
-      </w:r>
-    </w:p>
-    <w:p>
-      <w:pPr>
-        <w:pStyle w:val="FirstParagraph"/>
-      </w:pPr>
-      <w:r>
-        <w:t xml:space="preserve">Before we dive into descriptive statistics, let’s clarify some</w:t>
-      </w:r>
-      <w:r>
-        <w:t xml:space="preserve"> </w:t>
-      </w:r>
-      <w:r>
-        <w:t xml:space="preserve">fundamental concepts:</w:t>
-      </w:r>
-    </w:p>
-    <w:p>
-      <w:pPr>
-        <w:pStyle w:val="Compact"/>
-        <w:numPr>
-          <w:ilvl w:val="0"/>
-          <w:numId w:val="1009"/>
-        </w:numPr>
-      </w:pPr>
-      <w:r>
-        <w:rPr>
-          <w:b/>
-          <w:bCs/>
-        </w:rPr>
-        <w:t xml:space="preserve">Population</w:t>
-      </w:r>
-      <w:r>
-        <w:t xml:space="preserve">: The entire group of things under consideration; the</w:t>
-      </w:r>
-      <w:r>
-        <w:t xml:space="preserve"> </w:t>
-      </w:r>
-      <w:r>
-        <w:t xml:space="preserve">group for which answers obtained from measurements and statistical</w:t>
-      </w:r>
-      <w:r>
-        <w:t xml:space="preserve"> </w:t>
-      </w:r>
-      <w:r>
-        <w:t xml:space="preserve">analysis are pertinent.</w:t>
-      </w:r>
-    </w:p>
-    <w:p>
-      <w:pPr>
-        <w:pStyle w:val="Compact"/>
-        <w:numPr>
-          <w:ilvl w:val="0"/>
-          <w:numId w:val="1009"/>
-        </w:numPr>
-      </w:pPr>
-      <w:r>
-        <w:rPr>
-          <w:b/>
-          <w:bCs/>
-        </w:rPr>
-        <w:t xml:space="preserve">Sample</w:t>
-      </w:r>
-      <w:r>
-        <w:t xml:space="preserve">: A subset of the population that is actually measured.</w:t>
-      </w:r>
-    </w:p>
-    <w:p>
-      <w:pPr>
-        <w:pStyle w:val="Compact"/>
-        <w:numPr>
-          <w:ilvl w:val="0"/>
-          <w:numId w:val="1009"/>
-        </w:numPr>
-      </w:pPr>
-      <w:r>
-        <w:rPr>
-          <w:b/>
-          <w:bCs/>
-        </w:rPr>
-        <w:t xml:space="preserve">Sample unit</w:t>
-      </w:r>
-      <w:r>
-        <w:t xml:space="preserve">: The individual thing drawn from the population.</w:t>
-      </w:r>
-    </w:p>
-    <w:p>
-      <w:pPr>
-        <w:pStyle w:val="FirstParagraph"/>
-      </w:pPr>
-      <w:r>
-        <w:t xml:space="preserve">Types of populations:</w:t>
-      </w:r>
-    </w:p>
-    <w:p>
-      <w:pPr>
-        <w:pStyle w:val="Compact"/>
-        <w:numPr>
-          <w:ilvl w:val="0"/>
-          <w:numId w:val="1010"/>
-        </w:numPr>
-      </w:pPr>
-      <w:r>
-        <w:rPr>
-          <w:b/>
-          <w:bCs/>
-        </w:rPr>
-        <w:t xml:space="preserve">Observational population</w:t>
-      </w:r>
-      <w:r>
-        <w:t xml:space="preserve">: Usually finite but may be very large</w:t>
-      </w:r>
-      <w:r>
-        <w:t xml:space="preserve"> </w:t>
-      </w:r>
-      <w:r>
-        <w:t xml:space="preserve">(e.g., head width of all corn earworms in a field)</w:t>
-      </w:r>
-    </w:p>
-    <w:p>
-      <w:pPr>
-        <w:pStyle w:val="Compact"/>
-        <w:numPr>
-          <w:ilvl w:val="0"/>
-          <w:numId w:val="1010"/>
-        </w:numPr>
-      </w:pPr>
-      <w:r>
-        <w:rPr>
-          <w:b/>
-          <w:bCs/>
-        </w:rPr>
-        <w:t xml:space="preserve">Experimental population</w:t>
-      </w:r>
-      <w:r>
-        <w:t xml:space="preserve">: Often conceptually infinite (e.g., all</w:t>
-      </w:r>
-      <w:r>
-        <w:t xml:space="preserve"> </w:t>
-      </w:r>
-      <w:r>
-        <w:t xml:space="preserve">possible goldenrod plants that could receive a specific fertilizer</w:t>
-      </w:r>
-      <w:r>
-        <w:t xml:space="preserve"> </w:t>
-      </w:r>
-      <w:r>
-        <w:t xml:space="preserve">treatment)</w:t>
-      </w:r>
-    </w:p>
-    <w:p>
-      <w:pPr>
-        <w:pStyle w:val="FirstParagraph"/>
-      </w:pPr>
-      <w:r>
-        <w:t xml:space="preserve">Sampling involves</w:t>
-      </w:r>
-    </w:p>
-    <w:p>
-      <w:pPr>
-        <w:pStyle w:val="Compact"/>
-        <w:numPr>
-          <w:ilvl w:val="0"/>
-          <w:numId w:val="1011"/>
-        </w:numPr>
-      </w:pPr>
-      <w:r>
-        <w:rPr>
-          <w:b/>
-          <w:bCs/>
-        </w:rPr>
-        <w:t xml:space="preserve">inference</w:t>
-      </w:r>
-      <w:r>
-        <w:t xml:space="preserve"> </w:t>
-      </w:r>
-      <w:r>
-        <w:t xml:space="preserve">- generalizing from what is observed in the sample to</w:t>
-      </w:r>
-      <w:r>
-        <w:t xml:space="preserve"> </w:t>
-      </w:r>
-      <w:r>
-        <w:t xml:space="preserve">what is present in the population.</w:t>
-      </w:r>
-    </w:p>
-    <w:p>
-      <w:pPr>
-        <w:pStyle w:val="Compact"/>
-        <w:numPr>
-          <w:ilvl w:val="0"/>
-          <w:numId w:val="1011"/>
-        </w:numPr>
-      </w:pPr>
-      <w:r>
-        <w:t xml:space="preserve">Valid inference requires</w:t>
-      </w:r>
-      <w:r>
-        <w:t xml:space="preserve"> </w:t>
-      </w:r>
-      <w:r>
-        <w:rPr>
-          <w:b/>
-          <w:bCs/>
-        </w:rPr>
-        <w:t xml:space="preserve">random sampling</w:t>
-      </w:r>
-      <w:r>
-        <w:t xml:space="preserve">.</w:t>
-      </w:r>
-    </w:p>
-    <w:p>
-      <w:pPr>
-        <w:pStyle w:val="FirstParagraph"/>
-      </w:pPr>
-      <w:r>
-        <w:drawing>
-          <wp:inline>
-            <wp:extent cx="2019300" cy="2828925"/>
-            <wp:effectExtent b="0" l="0" r="0" t="0"/>
-            <wp:docPr descr="" title="" id="40" name="Picture"/>
-            <a:graphic>
-              <a:graphicData uri="http://schemas.openxmlformats.org/drawingml/2006/picture">
-                <pic:pic>
-                  <pic:nvPicPr>
-                    <pic:cNvPr descr="images/pop_sample_stats.png" id="41" name="Picture"/>
-                    <pic:cNvPicPr>
-                      <a:picLocks noChangeArrowheads="1" noChangeAspect="1"/>
-                    </pic:cNvPicPr>
-                  </pic:nvPicPr>
-                  <pic:blipFill>
-                    <a:blip r:embed="rId28"/>
-                    <a:stretch>
-                      <a:fillRect/>
-                    </a:stretch>
-                  </pic:blipFill>
-                  <pic:spPr bwMode="auto">
-                    <a:xfrm>
-                      <a:off x="0" y="0"/>
-                      <a:ext cx="2019300" cy="2828925"/>
-                    </a:xfrm>
-                    <a:prstGeom prst="rect">
-                      <a:avLst/>
-                    </a:prstGeom>
-                    <a:noFill/>
-                    <a:ln w="9525">
-                      <a:noFill/>
-                      <a:headEnd/>
-                      <a:tailEnd/>
-                    </a:ln>
-                  </pic:spPr>
-                </pic:pic>
-              </a:graphicData>
-            </a:graphic>
-          </wp:inline>
-        </w:drawing>
-      </w:r>
-    </w:p>
-    <w:bookmarkEnd w:id="42"/>
-    <w:bookmarkStart w:id="45" w:name="lecture-3-parameters-vs.-statistics"/>
-    <w:p>
-      <w:pPr>
-        <w:pStyle w:val="Heading1"/>
-      </w:pPr>
-      <w:r>
-        <w:t xml:space="preserve">Lecture 3: Parameters vs. Statistics</w:t>
-      </w:r>
-    </w:p>
-    <w:p>
-      <w:pPr>
-        <w:pStyle w:val="FirstParagraph"/>
-      </w:pPr>
-      <w:r>
-        <w:t xml:space="preserve">It’s important to distinguish between:</w:t>
-      </w:r>
-    </w:p>
-    <w:p>
-      <w:pPr>
-        <w:pStyle w:val="Compact"/>
-        <w:numPr>
-          <w:ilvl w:val="0"/>
-          <w:numId w:val="1012"/>
-        </w:numPr>
-      </w:pPr>
-      <w:r>
-        <w:rPr>
-          <w:b/>
-          <w:bCs/>
-        </w:rPr>
-        <w:t xml:space="preserve">Parameters</w:t>
-      </w:r>
-      <w:r>
-        <w:t xml:space="preserve">: True numerical values for a population (usually</w:t>
-      </w:r>
-      <w:r>
-        <w:t xml:space="preserve"> </w:t>
-      </w:r>
-      <w:r>
-        <w:t xml:space="preserve">denoted by Greek letters)</w:t>
-      </w:r>
-    </w:p>
-    <w:p>
-      <w:pPr>
-        <w:pStyle w:val="Compact"/>
-        <w:numPr>
-          <w:ilvl w:val="0"/>
-          <w:numId w:val="1012"/>
-        </w:numPr>
-      </w:pPr>
-      <w:r>
-        <w:rPr>
-          <w:b/>
-          <w:bCs/>
-        </w:rPr>
-        <w:t xml:space="preserve">Statistics</w:t>
-      </w:r>
-      <w:r>
-        <w:t xml:space="preserve">: Estimates of parameters based on samples (usually</w:t>
-      </w:r>
-      <w:r>
-        <w:t xml:space="preserve"> </w:t>
-      </w:r>
-      <w:r>
-        <w:t xml:space="preserve">denoted by Roman letters)</w:t>
-      </w:r>
-    </w:p>
-    <w:p>
-      <w:pPr>
-        <w:pStyle w:val="FirstParagraph"/>
-      </w:pPr>
-      <w:r>
-        <w:t xml:space="preserve">For example:</w:t>
-      </w:r>
-    </w:p>
-    <w:p>
-      <w:pPr>
-        <w:pStyle w:val="Compact"/>
-        <w:numPr>
-          <w:ilvl w:val="0"/>
-          <w:numId w:val="1013"/>
-        </w:numPr>
-      </w:pPr>
-      <w:r>
-        <w:t xml:space="preserve">Population mean (μ) is estimated by sample mean (Y̅)</w:t>
-      </w:r>
-    </w:p>
-    <w:p>
-      <w:pPr>
-        <w:pStyle w:val="Compact"/>
-        <w:numPr>
-          <w:ilvl w:val="0"/>
-          <w:numId w:val="1013"/>
-        </w:numPr>
-      </w:pPr>
-      <w:r>
-        <w:t xml:space="preserve">Population standard deviation (σ) is estimated by sample standard</w:t>
-      </w:r>
-      <w:r>
-        <w:t xml:space="preserve"> </w:t>
-      </w:r>
-      <w:r>
-        <w:t xml:space="preserve">deviation (s)</w:t>
-      </w:r>
-    </w:p>
-    <w:p>
-      <w:pPr>
-        <w:pStyle w:val="FirstParagraph"/>
-      </w:pPr>
-      <w:r>
-        <w:t xml:space="preserve">The standard deviation formula above includes n-1 in the denominator</w:t>
-      </w:r>
-      <w:r>
-        <w:t xml:space="preserve"> </w:t>
-      </w:r>
-      <w:r>
-        <w:t xml:space="preserve">(rather than n) to provide an unbiased estimate of the population</w:t>
-      </w:r>
-      <w:r>
-        <w:t xml:space="preserve"> </w:t>
-      </w:r>
-      <w:r>
-        <w:t xml:space="preserve">parameter.</w:t>
-      </w:r>
-    </w:p>
-    <w:p>
-      <w:pPr>
-        <w:pStyle w:val="BodyText"/>
-      </w:pPr>
-      <w:r>
-        <w:drawing>
-          <wp:inline>
-            <wp:extent cx="1819275" cy="2657475"/>
-            <wp:effectExtent b="0" l="0" r="0" t="0"/>
-            <wp:docPr descr="" title="" id="43" name="Picture"/>
-            <a:graphic>
-              <a:graphicData uri="http://schemas.openxmlformats.org/drawingml/2006/picture">
-                <pic:pic>
-                  <pic:nvPicPr>
-                    <pic:cNvPr descr="images/pop_sample_stats.png" id="44" name="Picture"/>
-                    <pic:cNvPicPr>
-                      <a:picLocks noChangeArrowheads="1" noChangeAspect="1"/>
-                    </pic:cNvPicPr>
-                  </pic:nvPicPr>
-                  <pic:blipFill>
-                    <a:blip r:embed="rId28"/>
-                    <a:stretch>
-                      <a:fillRect/>
-                    </a:stretch>
-                  </pic:blipFill>
-                  <pic:spPr bwMode="auto">
-                    <a:xfrm>
-                      <a:off x="0" y="0"/>
-                      <a:ext cx="1819275" cy="2657475"/>
-                    </a:xfrm>
-                    <a:prstGeom prst="rect">
-                      <a:avLst/>
-                    </a:prstGeom>
-                    <a:noFill/>
-                    <a:ln w="9525">
-                      <a:noFill/>
-                      <a:headEnd/>
-                      <a:tailEnd/>
-                    </a:ln>
-                  </pic:spPr>
-                </pic:pic>
-              </a:graphicData>
-            </a:graphic>
-          </wp:inline>
-        </w:drawing>
-      </w:r>
-    </w:p>
-    <w:bookmarkEnd w:id="45"/>
-    <w:bookmarkStart w:id="50" w:name="lecture-3-kinds-of-biological-variables"/>
-    <w:p>
-      <w:pPr>
-        <w:pStyle w:val="Heading1"/>
-      </w:pPr>
-      <w:r>
-        <w:t xml:space="preserve">Lecture 3: Kinds of Biological Variables</w:t>
-      </w:r>
-    </w:p>
-    <w:bookmarkStart w:id="46" w:name="X8312cc2d45c298857540977a296cd6032182a47"/>
-    <w:p>
-      <w:pPr>
-        <w:pStyle w:val="Heading3"/>
-      </w:pPr>
-      <w:r>
-        <w:t xml:space="preserve">Understanding the type of variable you’re working with is essential for selecting appropriate statistics:</w:t>
-      </w:r>
-    </w:p>
-    <w:bookmarkEnd w:id="46"/>
-    <w:bookmarkStart w:id="47" w:name="measurement-or-quantitative-variables"/>
-    <w:p>
-      <w:pPr>
-        <w:pStyle w:val="Heading3"/>
-      </w:pPr>
-      <w:r>
-        <w:t xml:space="preserve">Measurement or Quantitative Variables</w:t>
-      </w:r>
-    </w:p>
-    <w:p>
-      <w:pPr>
-        <w:pStyle w:val="Compact"/>
-        <w:numPr>
-          <w:ilvl w:val="0"/>
-          <w:numId w:val="1014"/>
-        </w:numPr>
-      </w:pPr>
-      <w:r>
-        <w:rPr>
-          <w:b/>
-          <w:bCs/>
-        </w:rPr>
-        <w:t xml:space="preserve">Continuous</w:t>
-      </w:r>
-      <w:r>
-        <w:t xml:space="preserve">: Any value between extremes of scale is possible</w:t>
-      </w:r>
-      <w:r>
-        <w:t xml:space="preserve"> </w:t>
-      </w:r>
-      <w:r>
-        <w:t xml:space="preserve">(e.g., mass, length)</w:t>
-      </w:r>
-    </w:p>
-    <w:p>
-      <w:pPr>
-        <w:pStyle w:val="Compact"/>
-        <w:numPr>
-          <w:ilvl w:val="0"/>
-          <w:numId w:val="1014"/>
-        </w:numPr>
-      </w:pPr>
-      <w:r>
-        <w:rPr>
-          <w:b/>
-          <w:bCs/>
-        </w:rPr>
-        <w:t xml:space="preserve">Discrete (meristic)</w:t>
-      </w:r>
-      <w:r>
-        <w:t xml:space="preserve">: Only fixed values (usually integers)</w:t>
-      </w:r>
-      <w:r>
-        <w:t xml:space="preserve"> </w:t>
-      </w:r>
-      <w:r>
-        <w:t xml:space="preserve">between extremes are possible (e.g., bristle number, egg count)</w:t>
-      </w:r>
-    </w:p>
-    <w:bookmarkEnd w:id="47"/>
-    <w:bookmarkStart w:id="48" w:name="rank-variables-ordinal"/>
-    <w:p>
-      <w:pPr>
-        <w:pStyle w:val="Heading3"/>
-      </w:pPr>
-      <w:r>
-        <w:t xml:space="preserve">Rank Variables (Ordinal)</w:t>
-      </w:r>
-    </w:p>
-    <w:p>
-      <w:pPr>
-        <w:pStyle w:val="Compact"/>
-        <w:numPr>
-          <w:ilvl w:val="0"/>
-          <w:numId w:val="1015"/>
-        </w:numPr>
-      </w:pPr>
-      <w:r>
-        <w:t xml:space="preserve">Assign only order, not quantity</w:t>
-      </w:r>
-    </w:p>
-    <w:p>
-      <w:pPr>
-        <w:pStyle w:val="Compact"/>
-        <w:numPr>
-          <w:ilvl w:val="0"/>
-          <w:numId w:val="1015"/>
-        </w:numPr>
-      </w:pPr>
-      <w:r>
-        <w:t xml:space="preserve">Nothing implied about relative distance between values</w:t>
-      </w:r>
-    </w:p>
-    <w:bookmarkEnd w:id="48"/>
-    <w:bookmarkStart w:id="49" w:name="categorical-variables-qualitative"/>
-    <w:p>
-      <w:pPr>
-        <w:pStyle w:val="Heading3"/>
-      </w:pPr>
-      <w:r>
-        <w:t xml:space="preserve">Categorical Variables (Qualitative)</w:t>
-      </w:r>
-    </w:p>
-    <w:p>
-      <w:pPr>
-        <w:pStyle w:val="Compact"/>
-        <w:numPr>
-          <w:ilvl w:val="0"/>
-          <w:numId w:val="1016"/>
-        </w:numPr>
-      </w:pPr>
-      <w:r>
-        <w:t xml:space="preserve">No quantitative information (e.g., male/female, living/dead)</w:t>
-      </w:r>
-    </w:p>
-    <w:p>
-      <w:pPr>
-        <w:pStyle w:val="Compact"/>
-        <w:numPr>
-          <w:ilvl w:val="0"/>
-          <w:numId w:val="1016"/>
-        </w:numPr>
-      </w:pPr>
-      <w:r>
-        <w:t xml:space="preserve">Some are simplifications of quantitative variables (e.g., color</w:t>
-      </w:r>
-      <w:r>
-        <w:t xml:space="preserve"> </w:t>
-      </w:r>
-      <w:r>
-        <w:t xml:space="preserve">instead of wavelength)</w:t>
-      </w:r>
-    </w:p>
-    <w:bookmarkEnd w:id="49"/>
-    <w:bookmarkEnd w:id="50"/>
-    <w:bookmarkStart w:id="52" w:name="lecture-3-derived-variables"/>
-    <w:p>
-      <w:pPr>
-        <w:pStyle w:val="Heading1"/>
-      </w:pPr>
-      <w:r>
-        <w:t xml:space="preserve">Lecture 3: Derived Variables</w:t>
-      </w:r>
-    </w:p>
-    <w:bookmarkStart w:id="51" w:name="derived-variables"/>
-    <w:p>
-      <w:pPr>
-        <w:pStyle w:val="Heading3"/>
-      </w:pPr>
-      <w:r>
-        <w:t xml:space="preserve">Derived Variables</w:t>
-      </w:r>
-    </w:p>
-    <w:p>
-      <w:pPr>
-        <w:pStyle w:val="Compact"/>
-        <w:numPr>
-          <w:ilvl w:val="0"/>
-          <w:numId w:val="1017"/>
-        </w:numPr>
-      </w:pPr>
-      <w:r>
-        <w:rPr>
-          <w:b/>
-          <w:bCs/>
-        </w:rPr>
-        <w:t xml:space="preserve">Percentages, Proportions</w:t>
-      </w:r>
-      <w:r>
-        <w:t xml:space="preserve">: Ratio of some component to total</w:t>
-      </w:r>
-    </w:p>
-    <w:p>
-      <w:pPr>
-        <w:pStyle w:val="Compact"/>
-        <w:numPr>
-          <w:ilvl w:val="0"/>
-          <w:numId w:val="1017"/>
-        </w:numPr>
-      </w:pPr>
-      <w:r>
-        <w:rPr>
-          <w:b/>
-          <w:bCs/>
-        </w:rPr>
-        <w:t xml:space="preserve">Ratios</w:t>
-      </w:r>
-      <w:r>
-        <w:t xml:space="preserve">: Relation of two variables</w:t>
-      </w:r>
-    </w:p>
-    <w:p>
-      <w:pPr>
-        <w:pStyle w:val="Compact"/>
-        <w:numPr>
-          <w:ilvl w:val="0"/>
-          <w:numId w:val="1017"/>
-        </w:numPr>
-      </w:pPr>
-      <w:r>
-        <w:rPr>
-          <w:b/>
-          <w:bCs/>
-        </w:rPr>
-        <w:t xml:space="preserve">Rates</w:t>
-      </w:r>
-      <w:r>
-        <w:t xml:space="preserve">: Quantity per unit (time, mass, etc.)</w:t>
-      </w:r>
-    </w:p>
-    <w:p>
-      <w:pPr>
-        <w:pStyle w:val="Compact"/>
-        <w:numPr>
-          <w:ilvl w:val="0"/>
-          <w:numId w:val="1017"/>
-        </w:numPr>
-      </w:pPr>
-      <w:r>
-        <w:rPr>
-          <w:b/>
-          <w:bCs/>
-        </w:rPr>
-        <w:t xml:space="preserve">Indices</w:t>
-      </w:r>
-      <w:r>
-        <w:t xml:space="preserve">: More complex derived variables (e.g., condition index)</w:t>
-      </w:r>
-    </w:p>
-    <w:p>
-      <w:pPr>
-        <w:pStyle w:val="FirstParagraph"/>
-      </w:pPr>
-      <w:r>
-        <w:t xml:space="preserve">Let’s explore our grayling dataset and identify the types of variables</w:t>
-      </w:r>
-      <w:r>
-        <w:t xml:space="preserve"> </w:t>
-      </w:r>
-      <w:r>
-        <w:t xml:space="preserve">it contains.</w:t>
-      </w:r>
-    </w:p>
-    <w:bookmarkEnd w:id="51"/>
     <w:bookmarkEnd w:id="52"/>
     <w:bookmarkStart w:id="55" w:name="Xb2959eae8a3ded93c898852772e5a165db8e609"/>
     <w:p>
@@ -1648,7 +1725,7 @@
                           </pic:cNvPicPr>
                         </pic:nvPicPr>
                         <pic:blipFill>
-                          <a:blip r:embed="rId36"/>
+                          <a:blip r:embed="rId49"/>
                           <a:stretch>
                             <a:fillRect/>
                           </a:stretch>
@@ -1939,7 +2016,7 @@
         <w:pStyle w:val="Compact"/>
         <w:numPr>
           <w:ilvl w:val="0"/>
-          <w:numId w:val="1018"/>
+          <w:numId w:val="1019"/>
         </w:numPr>
       </w:pPr>
       <w:r>
@@ -1956,77 +2033,147 @@
     <w:p>
       <w:pPr>
         <w:pStyle w:val="Compact"/>
-        <w:numPr>
-          <w:ilvl w:val="0"/>
-          <w:numId w:val="1018"/>
-        </w:numPr>
-      </w:pPr>
-      <w:r>
-        <w:rPr>
-          <w:b/>
-          <w:bCs/>
-        </w:rPr>
-        <w:t xml:space="preserve">Precision</w:t>
-      </w:r>
-      <w:r>
-        <w:t xml:space="preserve">: Closeness of repeated measurements to each other</w:t>
-      </w:r>
-      <w:r>
-        <w:t xml:space="preserve"> </w:t>
-      </w:r>
-      <w:r>
-        <w:t xml:space="preserve">(repeatability)</w:t>
-      </w:r>
-    </w:p>
-    <w:p>
-      <w:pPr>
-        <w:pStyle w:val="Compact"/>
-        <w:numPr>
-          <w:ilvl w:val="0"/>
-          <w:numId w:val="1018"/>
-        </w:numPr>
-      </w:pPr>
-      <w:r>
-        <w:rPr>
-          <w:b/>
-          <w:bCs/>
-        </w:rPr>
-        <w:t xml:space="preserve">Bias</w:t>
-      </w:r>
-      <w:r>
-        <w:t xml:space="preserve">: Systematic departure from the true value</w:t>
-      </w:r>
-    </w:p>
-    <w:p>
-      <w:pPr>
-        <w:pStyle w:val="FirstParagraph"/>
-      </w:pPr>
-      <w:r>
-        <w:t xml:space="preserve">Accuracy is a function of both precision and bias. For statisticians,</w:t>
-      </w:r>
-      <w:r>
-        <w:t xml:space="preserve"> </w:t>
-      </w:r>
-      <w:r>
-        <w:t xml:space="preserve">bias is usually a more serious problem than low precision because:</w:t>
-      </w:r>
-    </w:p>
-    <w:p>
-      <w:pPr>
         <w:numPr>
           <w:ilvl w:val="0"/>
           <w:numId w:val="1019"/>
         </w:numPr>
       </w:pPr>
       <w:r>
-        <w:t xml:space="preserve">It’s harder to detect (true value usually unknown)</w:t>
-      </w:r>
-    </w:p>
-    <w:p>
-      <w:pPr>
+        <w:rPr>
+          <w:b/>
+          <w:bCs/>
+        </w:rPr>
+        <w:t xml:space="preserve">Precision</w:t>
+      </w:r>
+      <w:r>
+        <w:t xml:space="preserve">: Closeness of repeated measurements to each other</w:t>
+      </w:r>
+      <w:r>
+        <w:t xml:space="preserve"> </w:t>
+      </w:r>
+      <w:r>
+        <w:t xml:space="preserve">(repeatability)</w:t>
+      </w:r>
+    </w:p>
+    <w:p>
+      <w:pPr>
+        <w:pStyle w:val="Compact"/>
         <w:numPr>
           <w:ilvl w:val="0"/>
           <w:numId w:val="1019"/>
+        </w:numPr>
+      </w:pPr>
+      <w:r>
+        <w:rPr>
+          <w:b/>
+          <w:bCs/>
+        </w:rPr>
+        <w:t xml:space="preserve">Bias</w:t>
+      </w:r>
+      <w:r>
+        <w:t xml:space="preserve">: Systematic departure from the true value</w:t>
+      </w:r>
+    </w:p>
+    <w:p>
+      <w:pPr>
+        <w:pStyle w:val="FirstParagraph"/>
+      </w:pPr>
+      <w:r>
+        <w:rPr>
+          <w:b/>
+          <w:bCs/>
+        </w:rPr>
+        <w:t xml:space="preserve">Accuracy</w:t>
+      </w:r>
+      <w:r>
+        <w:t xml:space="preserve"> </w:t>
+      </w:r>
+      <w:r>
+        <w:t xml:space="preserve">is a</w:t>
+      </w:r>
+      <w:r>
+        <w:t xml:space="preserve"> </w:t>
+      </w:r>
+      <w:r>
+        <w:rPr>
+          <w:b/>
+          <w:bCs/>
+        </w:rPr>
+        <w:t xml:space="preserve">function</w:t>
+      </w:r>
+      <w:r>
+        <w:t xml:space="preserve"> </w:t>
+      </w:r>
+      <w:r>
+        <w:t xml:space="preserve">of</w:t>
+      </w:r>
+      <w:r>
+        <w:t xml:space="preserve"> </w:t>
+      </w:r>
+      <w:r>
+        <w:rPr>
+          <w:b/>
+          <w:bCs/>
+        </w:rPr>
+        <w:t xml:space="preserve">both precision and bias</w:t>
+      </w:r>
+      <w:r>
+        <w:t xml:space="preserve">.</w:t>
+      </w:r>
+    </w:p>
+    <w:p>
+      <w:pPr>
+        <w:pStyle w:val="BodyText"/>
+      </w:pPr>
+      <w:r>
+        <w:t xml:space="preserve">For statisticians,</w:t>
+      </w:r>
+      <w:r>
+        <w:t xml:space="preserve"> </w:t>
+      </w:r>
+      <w:r>
+        <w:rPr>
+          <w:b/>
+          <w:bCs/>
+        </w:rPr>
+        <w:t xml:space="preserve">BIAS is usually a more serious problem than low</w:t>
+      </w:r>
+      <w:r>
+        <w:rPr>
+          <w:b/>
+          <w:bCs/>
+        </w:rPr>
+        <w:t xml:space="preserve"> </w:t>
+      </w:r>
+      <w:r>
+        <w:rPr>
+          <w:b/>
+          <w:bCs/>
+        </w:rPr>
+        <w:t xml:space="preserve">precision because</w:t>
+      </w:r>
+      <w:r>
+        <w:t xml:space="preserve">:</w:t>
+      </w:r>
+    </w:p>
+    <w:p>
+      <w:pPr>
+        <w:pStyle w:val="Compact"/>
+        <w:numPr>
+          <w:ilvl w:val="0"/>
+          <w:numId w:val="1020"/>
+        </w:numPr>
+      </w:pPr>
+      <w:r>
+        <w:t xml:space="preserve">It’s harder to detect (true value usually unknown)</w:t>
+      </w:r>
+    </w:p>
+    <w:p>
+      <w:pPr>
+        <w:pStyle w:val="Compact"/>
+        <w:numPr>
+          <w:ilvl w:val="0"/>
+          <w:numId w:val="1020"/>
         </w:numPr>
       </w:pPr>
       <w:r>
@@ -2143,7 +2290,7 @@
                           </pic:cNvPicPr>
                         </pic:nvPicPr>
                         <pic:blipFill>
-                          <a:blip r:embed="rId36"/>
+                          <a:blip r:embed="rId49"/>
                           <a:stretch>
                             <a:fillRect/>
                           </a:stretch>
@@ -2176,7 +2323,7 @@
               <w:t xml:space="preserve"> </w:t>
             </w:r>
             <w:r>
-              <w:t xml:space="preserve">Practice Exercise 1: What are potential sources of error in pine needles or fish?</w:t>
+              <w:t xml:space="preserve">Practice Exercise 1: What are potential sources of error in fish data?</w:t>
             </w:r>
           </w:p>
         </w:tc>
@@ -2214,7 +2361,7 @@
               <w:pStyle w:val="Compact"/>
               <w:numPr>
                 <w:ilvl w:val="0"/>
-                <w:numId w:val="1020"/>
+                <w:numId w:val="1021"/>
               </w:numPr>
             </w:pPr>
             <w:r>
@@ -2226,7 +2373,7 @@
               <w:pStyle w:val="Compact"/>
               <w:numPr>
                 <w:ilvl w:val="1"/>
-                <w:numId w:val="1021"/>
+                <w:numId w:val="1022"/>
               </w:numPr>
             </w:pPr>
             <w:r>
@@ -2238,7 +2385,7 @@
               <w:pStyle w:val="Compact"/>
               <w:numPr>
                 <w:ilvl w:val="0"/>
-                <w:numId w:val="1020"/>
+                <w:numId w:val="1021"/>
               </w:numPr>
             </w:pPr>
             <w:r>
@@ -2250,7 +2397,7 @@
               <w:pStyle w:val="Compact"/>
               <w:numPr>
                 <w:ilvl w:val="1"/>
-                <w:numId w:val="1022"/>
+                <w:numId w:val="1023"/>
               </w:numPr>
             </w:pPr>
             <w:r>
@@ -2268,7 +2415,7 @@
               <w:pStyle w:val="Compact"/>
               <w:numPr>
                 <w:ilvl w:val="0"/>
-                <w:numId w:val="1020"/>
+                <w:numId w:val="1021"/>
               </w:numPr>
             </w:pPr>
             <w:r>
@@ -2440,7 +2587,7 @@
         <w:pStyle w:val="Compact"/>
         <w:numPr>
           <w:ilvl w:val="0"/>
-          <w:numId w:val="1023"/>
+          <w:numId w:val="1024"/>
         </w:numPr>
       </w:pPr>
       <m:oMath>
@@ -2469,7 +2616,7 @@
         <w:pStyle w:val="Compact"/>
         <w:numPr>
           <w:ilvl w:val="0"/>
-          <w:numId w:val="1023"/>
+          <w:numId w:val="1024"/>
         </w:numPr>
       </w:pPr>
       <m:oMath>
@@ -2491,9 +2638,163 @@
       </w:pPr>
       <w:r>
         <w:rPr>
+          <w:rStyle w:val="CommentTok"/>
+        </w:rPr>
+        <w:t xml:space="preserve"># Calculate mean length of all fish</w:t>
+      </w:r>
+      <w:r>
+        <w:br/>
+      </w:r>
+      <w:r>
+        <w:rPr>
+          <w:rStyle w:val="FunctionTok"/>
+        </w:rPr>
+        <w:t xml:space="preserve">mean</w:t>
+      </w:r>
+      <w:r>
+        <w:rPr>
+          <w:rStyle w:val="NormalTok"/>
+        </w:rPr>
+        <w:t xml:space="preserve">(grayling_df</w:t>
+      </w:r>
+      <w:r>
+        <w:rPr>
+          <w:rStyle w:val="SpecialCharTok"/>
+        </w:rPr>
+        <w:t xml:space="preserve">$</w:t>
+      </w:r>
+      <w:r>
+        <w:rPr>
+          <w:rStyle w:val="NormalTok"/>
+        </w:rPr>
+        <w:t xml:space="preserve">length_mm)</w:t>
+      </w:r>
+    </w:p>
+    <w:p>
+      <w:pPr>
+        <w:pStyle w:val="SourceCode"/>
+      </w:pPr>
+      <w:r>
+        <w:rPr>
           <w:rStyle w:val="VerbatimChar"/>
         </w:rPr>
-        <w:t xml:space="preserve">Mean length of all fish: 324.5 mm</w:t>
+        <w:t xml:space="preserve">[1] 324.494</w:t>
+      </w:r>
+    </w:p>
+    <w:p>
+      <w:pPr>
+        <w:pStyle w:val="SourceCode"/>
+      </w:pPr>
+      <w:r>
+        <w:rPr>
+          <w:rStyle w:val="CommentTok"/>
+        </w:rPr>
+        <w:t xml:space="preserve"># Calculate mean by lake</w:t>
+      </w:r>
+      <w:r>
+        <w:br/>
+      </w:r>
+      <w:r>
+        <w:rPr>
+          <w:rStyle w:val="NormalTok"/>
+        </w:rPr>
+        <w:t xml:space="preserve">grayling_df </w:t>
+      </w:r>
+      <w:r>
+        <w:rPr>
+          <w:rStyle w:val="SpecialCharTok"/>
+        </w:rPr>
+        <w:t xml:space="preserve">%&gt;%</w:t>
+      </w:r>
+      <w:r>
+        <w:br/>
+      </w:r>
+      <w:r>
+        <w:rPr>
+          <w:rStyle w:val="NormalTok"/>
+        </w:rPr>
+        <w:t xml:space="preserve">  </w:t>
+      </w:r>
+      <w:r>
+        <w:rPr>
+          <w:rStyle w:val="FunctionTok"/>
+        </w:rPr>
+        <w:t xml:space="preserve">group_by</w:t>
+      </w:r>
+      <w:r>
+        <w:rPr>
+          <w:rStyle w:val="NormalTok"/>
+        </w:rPr>
+        <w:t xml:space="preserve">(lake) </w:t>
+      </w:r>
+      <w:r>
+        <w:rPr>
+          <w:rStyle w:val="SpecialCharTok"/>
+        </w:rPr>
+        <w:t xml:space="preserve">%&gt;%</w:t>
+      </w:r>
+      <w:r>
+        <w:br/>
+      </w:r>
+      <w:r>
+        <w:rPr>
+          <w:rStyle w:val="NormalTok"/>
+        </w:rPr>
+        <w:t xml:space="preserve">  </w:t>
+      </w:r>
+      <w:r>
+        <w:rPr>
+          <w:rStyle w:val="FunctionTok"/>
+        </w:rPr>
+        <w:t xml:space="preserve">summarise</w:t>
+      </w:r>
+      <w:r>
+        <w:rPr>
+          <w:rStyle w:val="NormalTok"/>
+        </w:rPr>
+        <w:t xml:space="preserve">(</w:t>
+      </w:r>
+      <w:r>
+        <w:rPr>
+          <w:rStyle w:val="AttributeTok"/>
+        </w:rPr>
+        <w:t xml:space="preserve">mean_length =</w:t>
+      </w:r>
+      <w:r>
+        <w:rPr>
+          <w:rStyle w:val="NormalTok"/>
+        </w:rPr>
+        <w:t xml:space="preserve"> </w:t>
+      </w:r>
+      <w:r>
+        <w:rPr>
+          <w:rStyle w:val="FunctionTok"/>
+        </w:rPr>
+        <w:t xml:space="preserve">mean</w:t>
+      </w:r>
+      <w:r>
+        <w:rPr>
+          <w:rStyle w:val="NormalTok"/>
+        </w:rPr>
+        <w:t xml:space="preserve">(length_mm, </w:t>
+      </w:r>
+      <w:r>
+        <w:rPr>
+          <w:rStyle w:val="AttributeTok"/>
+        </w:rPr>
+        <w:t xml:space="preserve">na.rm=</w:t>
+      </w:r>
+      <w:r>
+        <w:rPr>
+          <w:rStyle w:val="ConstantTok"/>
+        </w:rPr>
+        <w:t xml:space="preserve">TRUE</w:t>
+      </w:r>
+      <w:r>
+        <w:rPr>
+          <w:rStyle w:val="NormalTok"/>
+        </w:rPr>
+        <w:t xml:space="preserve">)) </w:t>
       </w:r>
     </w:p>
     <w:p>
@@ -2566,7 +2867,7 @@
         <w:pStyle w:val="Compact"/>
         <w:numPr>
           <w:ilvl w:val="0"/>
-          <w:numId w:val="1024"/>
+          <w:numId w:val="1025"/>
         </w:numPr>
       </w:pPr>
       <w:r>
@@ -2578,7 +2879,7 @@
         <w:pStyle w:val="Compact"/>
         <w:numPr>
           <w:ilvl w:val="0"/>
-          <w:numId w:val="1024"/>
+          <w:numId w:val="1025"/>
         </w:numPr>
       </w:pPr>
       <w:r>
@@ -2597,9 +2898,145 @@
       </w:pPr>
       <w:r>
         <w:rPr>
+          <w:rStyle w:val="CommentTok"/>
+        </w:rPr>
+        <w:t xml:space="preserve"># Calculate median length of all fish</w:t>
+      </w:r>
+      <w:r>
+        <w:br/>
+      </w:r>
+      <w:r>
+        <w:rPr>
+          <w:rStyle w:val="FunctionTok"/>
+        </w:rPr>
+        <w:t xml:space="preserve">median</w:t>
+      </w:r>
+      <w:r>
+        <w:rPr>
+          <w:rStyle w:val="NormalTok"/>
+        </w:rPr>
+        <w:t xml:space="preserve">(grayling_df</w:t>
+      </w:r>
+      <w:r>
+        <w:rPr>
+          <w:rStyle w:val="SpecialCharTok"/>
+        </w:rPr>
+        <w:t xml:space="preserve">$</w:t>
+      </w:r>
+      <w:r>
+        <w:rPr>
+          <w:rStyle w:val="NormalTok"/>
+        </w:rPr>
+        <w:t xml:space="preserve">length_mm)</w:t>
+      </w:r>
+    </w:p>
+    <w:p>
+      <w:pPr>
+        <w:pStyle w:val="SourceCode"/>
+      </w:pPr>
+      <w:r>
+        <w:rPr>
           <w:rStyle w:val="VerbatimChar"/>
         </w:rPr>
-        <w:t xml:space="preserve">Median length of all fish: 324.5 mm</w:t>
+        <w:t xml:space="preserve">[1] 324.5</w:t>
+      </w:r>
+    </w:p>
+    <w:p>
+      <w:pPr>
+        <w:pStyle w:val="SourceCode"/>
+      </w:pPr>
+      <w:r>
+        <w:rPr>
+          <w:rStyle w:val="CommentTok"/>
+        </w:rPr>
+        <w:t xml:space="preserve"># Calculate median by lake</w:t>
+      </w:r>
+      <w:r>
+        <w:br/>
+      </w:r>
+      <w:r>
+        <w:rPr>
+          <w:rStyle w:val="NormalTok"/>
+        </w:rPr>
+        <w:t xml:space="preserve">grayling_df </w:t>
+      </w:r>
+      <w:r>
+        <w:rPr>
+          <w:rStyle w:val="SpecialCharTok"/>
+        </w:rPr>
+        <w:t xml:space="preserve">%&gt;%</w:t>
+      </w:r>
+      <w:r>
+        <w:br/>
+      </w:r>
+      <w:r>
+        <w:rPr>
+          <w:rStyle w:val="NormalTok"/>
+        </w:rPr>
+        <w:t xml:space="preserve">  </w:t>
+      </w:r>
+      <w:r>
+        <w:rPr>
+          <w:rStyle w:val="FunctionTok"/>
+        </w:rPr>
+        <w:t xml:space="preserve">group_by</w:t>
+      </w:r>
+      <w:r>
+        <w:rPr>
+          <w:rStyle w:val="NormalTok"/>
+        </w:rPr>
+        <w:t xml:space="preserve">(lake) </w:t>
+      </w:r>
+      <w:r>
+        <w:rPr>
+          <w:rStyle w:val="SpecialCharTok"/>
+        </w:rPr>
+        <w:t xml:space="preserve">%&gt;%</w:t>
+      </w:r>
+      <w:r>
+        <w:br/>
+      </w:r>
+      <w:r>
+        <w:rPr>
+          <w:rStyle w:val="NormalTok"/>
+        </w:rPr>
+        <w:t xml:space="preserve">  </w:t>
+      </w:r>
+      <w:r>
+        <w:rPr>
+          <w:rStyle w:val="FunctionTok"/>
+        </w:rPr>
+        <w:t xml:space="preserve">summarise</w:t>
+      </w:r>
+      <w:r>
+        <w:rPr>
+          <w:rStyle w:val="NormalTok"/>
+        </w:rPr>
+        <w:t xml:space="preserve">(</w:t>
+      </w:r>
+      <w:r>
+        <w:rPr>
+          <w:rStyle w:val="AttributeTok"/>
+        </w:rPr>
+        <w:t xml:space="preserve">median_length =</w:t>
+      </w:r>
+      <w:r>
+        <w:rPr>
+          <w:rStyle w:val="NormalTok"/>
+        </w:rPr>
+        <w:t xml:space="preserve"> </w:t>
+      </w:r>
+      <w:r>
+        <w:rPr>
+          <w:rStyle w:val="FunctionTok"/>
+        </w:rPr>
+        <w:t xml:space="preserve">median</w:t>
+      </w:r>
+      <w:r>
+        <w:rPr>
+          <w:rStyle w:val="NormalTok"/>
+        </w:rPr>
+        <w:t xml:space="preserve">(length_mm)) </w:t>
       </w:r>
     </w:p>
     <w:p>
@@ -2826,7 +3263,7 @@
         <w:pStyle w:val="Compact"/>
         <w:numPr>
           <w:ilvl w:val="0"/>
-          <w:numId w:val="1025"/>
+          <w:numId w:val="1026"/>
         </w:numPr>
       </w:pPr>
       <w:r>
@@ -2974,18 +3411,240 @@
       </w:pPr>
       <w:r>
         <w:rPr>
-          <w:rStyle w:val="VerbatimChar"/>
-        </w:rPr>
-        <w:t xml:space="preserve">Variance of length: 4225.9 mm²</w:t>
-      </w:r>
-      <w:r>
-        <w:br/>
-      </w:r>
-      <w:r>
-        <w:rPr>
-          <w:rStyle w:val="VerbatimChar"/>
-        </w:rPr>
-        <w:t xml:space="preserve"> Standard deviation of length: 65 mm</w:t>
+          <w:rStyle w:val="CommentTok"/>
+        </w:rPr>
+        <w:t xml:space="preserve"># Calculate standard deviation of fish length</w:t>
+      </w:r>
+      <w:r>
+        <w:br/>
+      </w:r>
+      <w:r>
+        <w:rPr>
+          <w:rStyle w:val="NormalTok"/>
+        </w:rPr>
+        <w:t xml:space="preserve">var_length </w:t>
+      </w:r>
+      <w:r>
+        <w:rPr>
+          <w:rStyle w:val="OtherTok"/>
+        </w:rPr>
+        <w:t xml:space="preserve">&lt;-</w:t>
+      </w:r>
+      <w:r>
+        <w:rPr>
+          <w:rStyle w:val="NormalTok"/>
+        </w:rPr>
+        <w:t xml:space="preserve"> </w:t>
+      </w:r>
+      <w:r>
+        <w:rPr>
+          <w:rStyle w:val="FunctionTok"/>
+        </w:rPr>
+        <w:t xml:space="preserve">var</w:t>
+      </w:r>
+      <w:r>
+        <w:rPr>
+          <w:rStyle w:val="NormalTok"/>
+        </w:rPr>
+        <w:t xml:space="preserve">(grayling_df</w:t>
+      </w:r>
+      <w:r>
+        <w:rPr>
+          <w:rStyle w:val="SpecialCharTok"/>
+        </w:rPr>
+        <w:t xml:space="preserve">$</w:t>
+      </w:r>
+      <w:r>
+        <w:rPr>
+          <w:rStyle w:val="NormalTok"/>
+        </w:rPr>
+        <w:t xml:space="preserve">length_mm)</w:t>
+      </w:r>
+      <w:r>
+        <w:br/>
+      </w:r>
+      <w:r>
+        <w:rPr>
+          <w:rStyle w:val="NormalTok"/>
+        </w:rPr>
+        <w:t xml:space="preserve">sd_length </w:t>
+      </w:r>
+      <w:r>
+        <w:rPr>
+          <w:rStyle w:val="OtherTok"/>
+        </w:rPr>
+        <w:t xml:space="preserve">&lt;-</w:t>
+      </w:r>
+      <w:r>
+        <w:rPr>
+          <w:rStyle w:val="NormalTok"/>
+        </w:rPr>
+        <w:t xml:space="preserve"> </w:t>
+      </w:r>
+      <w:r>
+        <w:rPr>
+          <w:rStyle w:val="FunctionTok"/>
+        </w:rPr>
+        <w:t xml:space="preserve">sd</w:t>
+      </w:r>
+      <w:r>
+        <w:rPr>
+          <w:rStyle w:val="NormalTok"/>
+        </w:rPr>
+        <w:t xml:space="preserve">(grayling_df</w:t>
+      </w:r>
+      <w:r>
+        <w:rPr>
+          <w:rStyle w:val="SpecialCharTok"/>
+        </w:rPr>
+        <w:t xml:space="preserve">$</w:t>
+      </w:r>
+      <w:r>
+        <w:rPr>
+          <w:rStyle w:val="NormalTok"/>
+        </w:rPr>
+        <w:t xml:space="preserve">length_mm)</w:t>
+      </w:r>
+      <w:r>
+        <w:br/>
+      </w:r>
+      <w:r>
+        <w:br/>
+      </w:r>
+      <w:r>
+        <w:rPr>
+          <w:rStyle w:val="CommentTok"/>
+        </w:rPr>
+        <w:t xml:space="preserve"># Calculate by lake</w:t>
+      </w:r>
+      <w:r>
+        <w:br/>
+      </w:r>
+      <w:r>
+        <w:rPr>
+          <w:rStyle w:val="NormalTok"/>
+        </w:rPr>
+        <w:t xml:space="preserve">grayling_df </w:t>
+      </w:r>
+      <w:r>
+        <w:rPr>
+          <w:rStyle w:val="SpecialCharTok"/>
+        </w:rPr>
+        <w:t xml:space="preserve">%&gt;%</w:t>
+      </w:r>
+      <w:r>
+        <w:br/>
+      </w:r>
+      <w:r>
+        <w:rPr>
+          <w:rStyle w:val="NormalTok"/>
+        </w:rPr>
+        <w:t xml:space="preserve">  </w:t>
+      </w:r>
+      <w:r>
+        <w:rPr>
+          <w:rStyle w:val="FunctionTok"/>
+        </w:rPr>
+        <w:t xml:space="preserve">group_by</w:t>
+      </w:r>
+      <w:r>
+        <w:rPr>
+          <w:rStyle w:val="NormalTok"/>
+        </w:rPr>
+        <w:t xml:space="preserve">(lake) </w:t>
+      </w:r>
+      <w:r>
+        <w:rPr>
+          <w:rStyle w:val="SpecialCharTok"/>
+        </w:rPr>
+        <w:t xml:space="preserve">%&gt;%</w:t>
+      </w:r>
+      <w:r>
+        <w:br/>
+      </w:r>
+      <w:r>
+        <w:rPr>
+          <w:rStyle w:val="NormalTok"/>
+        </w:rPr>
+        <w:t xml:space="preserve">  </w:t>
+      </w:r>
+      <w:r>
+        <w:rPr>
+          <w:rStyle w:val="FunctionTok"/>
+        </w:rPr>
+        <w:t xml:space="preserve">summarise</w:t>
+      </w:r>
+      <w:r>
+        <w:rPr>
+          <w:rStyle w:val="NormalTok"/>
+        </w:rPr>
+        <w:t xml:space="preserve">(</w:t>
+      </w:r>
+      <w:r>
+        <w:br/>
+      </w:r>
+      <w:r>
+        <w:rPr>
+          <w:rStyle w:val="NormalTok"/>
+        </w:rPr>
+        <w:t xml:space="preserve">     </w:t>
+      </w:r>
+      <w:r>
+        <w:rPr>
+          <w:rStyle w:val="AttributeTok"/>
+        </w:rPr>
+        <w:t xml:space="preserve">var_length =</w:t>
+      </w:r>
+      <w:r>
+        <w:rPr>
+          <w:rStyle w:val="NormalTok"/>
+        </w:rPr>
+        <w:t xml:space="preserve"> </w:t>
+      </w:r>
+      <w:r>
+        <w:rPr>
+          <w:rStyle w:val="FunctionTok"/>
+        </w:rPr>
+        <w:t xml:space="preserve">var</w:t>
+      </w:r>
+      <w:r>
+        <w:rPr>
+          <w:rStyle w:val="NormalTok"/>
+        </w:rPr>
+        <w:t xml:space="preserve">(length_mm), </w:t>
+      </w:r>
+      <w:r>
+        <w:br/>
+      </w:r>
+      <w:r>
+        <w:rPr>
+          <w:rStyle w:val="NormalTok"/>
+        </w:rPr>
+        <w:t xml:space="preserve">     </w:t>
+      </w:r>
+      <w:r>
+        <w:rPr>
+          <w:rStyle w:val="AttributeTok"/>
+        </w:rPr>
+        <w:t xml:space="preserve">sd_length =</w:t>
+      </w:r>
+      <w:r>
+        <w:rPr>
+          <w:rStyle w:val="NormalTok"/>
+        </w:rPr>
+        <w:t xml:space="preserve"> </w:t>
+      </w:r>
+      <w:r>
+        <w:rPr>
+          <w:rStyle w:val="FunctionTok"/>
+        </w:rPr>
+        <w:t xml:space="preserve">sd</w:t>
+      </w:r>
+      <w:r>
+        <w:rPr>
+          <w:rStyle w:val="NormalTok"/>
+        </w:rPr>
+        <w:t xml:space="preserve">(length_mm) ) </w:t>
       </w:r>
     </w:p>
     <w:p>
@@ -3056,7 +3715,7 @@
         <w:t xml:space="preserve"> </w:t>
       </w:r>
       <w:r>
-        <w:t xml:space="preserve">Standard deviations on each side includes about 95% of the data</w:t>
+        <w:t xml:space="preserve">standard deviations on each side includes about 95% of the data</w:t>
       </w:r>
       <w:r>
         <w:br/>
@@ -3070,10 +3729,26 @@
     </w:p>
     <w:p>
       <w:pPr>
-        <w:pStyle w:val="BodyText"/>
-      </w:pPr>
-      <w:r>
-        <w:t xml:space="preserve">- note the similarity to the p &lt; 0.5</w:t>
+        <w:pStyle w:val="Compact"/>
+        <w:numPr>
+          <w:ilvl w:val="0"/>
+          <w:numId w:val="1027"/>
+        </w:numPr>
+      </w:pPr>
+      <w:r>
+        <w:t xml:space="preserve">note the similarity to the p &lt; 0.5</w:t>
+      </w:r>
+    </w:p>
+    <w:p>
+      <w:pPr>
+        <w:pStyle w:val="Compact"/>
+        <w:numPr>
+          <w:ilvl w:val="0"/>
+          <w:numId w:val="1027"/>
+        </w:numPr>
+      </w:pPr>
+      <w:r>
+        <w:t xml:space="preserve">note that it is 90.91% and that is because the curve is not normal</w:t>
       </w:r>
     </w:p>
     <w:p>
@@ -3630,7 +4305,7 @@
       <w:pPr>
         <w:numPr>
           <w:ilvl w:val="0"/>
-          <w:numId w:val="1026"/>
+          <w:numId w:val="1028"/>
         </w:numPr>
       </w:pPr>
       <w:r>
@@ -3642,7 +4317,7 @@
         <w:pStyle w:val="Compact"/>
         <w:numPr>
           <w:ilvl w:val="1"/>
-          <w:numId w:val="1027"/>
+          <w:numId w:val="1029"/>
         </w:numPr>
       </w:pPr>
       <w:r>
@@ -3654,7 +4329,7 @@
         <w:pStyle w:val="Compact"/>
         <w:numPr>
           <w:ilvl w:val="2"/>
-          <w:numId w:val="1028"/>
+          <w:numId w:val="1030"/>
         </w:numPr>
       </w:pPr>
       <w:r>
@@ -3666,7 +4341,7 @@
         <w:pStyle w:val="Compact"/>
         <w:numPr>
           <w:ilvl w:val="1"/>
-          <w:numId w:val="1027"/>
+          <w:numId w:val="1029"/>
         </w:numPr>
       </w:pPr>
       <w:r>
@@ -3762,10 +4437,36 @@
     </w:p>
     <w:p>
       <w:pPr>
+        <w:pStyle w:val="FirstParagraph"/>
+      </w:pPr>
+      <w:r>
+        <w:t xml:space="preserve">To tranform data to a</w:t>
+      </w:r>
+      <w:r>
+        <w:t xml:space="preserve"> </w:t>
+      </w:r>
+      <w:r>
+        <w:t xml:space="preserve">“normal”</w:t>
+      </w:r>
+      <w:r>
+        <w:t xml:space="preserve"> </w:t>
+      </w:r>
+      <w:r>
+        <w:t xml:space="preserve">distribution we can use the following</w:t>
+      </w:r>
+      <w:r>
+        <w:t xml:space="preserve"> </w:t>
+      </w:r>
+      <w:r>
+        <w:t xml:space="preserve">transformations…</w:t>
+      </w:r>
+    </w:p>
+    <w:p>
+      <w:pPr>
         <w:pStyle w:val="Compact"/>
         <w:numPr>
           <w:ilvl w:val="0"/>
-          <w:numId w:val="1029"/>
+          <w:numId w:val="1031"/>
         </w:numPr>
       </w:pPr>
       <w:r>
@@ -3790,7 +4491,7 @@
         <w:pStyle w:val="Compact"/>
         <w:numPr>
           <w:ilvl w:val="0"/>
-          <w:numId w:val="1029"/>
+          <w:numId w:val="1031"/>
         </w:numPr>
       </w:pPr>
       <w:r>
@@ -3815,7 +4516,7 @@
         <w:pStyle w:val="Compact"/>
         <w:numPr>
           <w:ilvl w:val="0"/>
-          <w:numId w:val="1029"/>
+          <w:numId w:val="1031"/>
         </w:numPr>
       </w:pPr>
       <w:r>
@@ -3834,7 +4535,7 @@
         <w:pStyle w:val="Compact"/>
         <w:numPr>
           <w:ilvl w:val="0"/>
-          <w:numId w:val="1029"/>
+          <w:numId w:val="1031"/>
         </w:numPr>
       </w:pPr>
       <w:r>
@@ -4571,7 +5272,7 @@
         <w:pStyle w:val="Compact"/>
         <w:numPr>
           <w:ilvl w:val="0"/>
-          <w:numId w:val="1030"/>
+          <w:numId w:val="1032"/>
         </w:numPr>
       </w:pPr>
       <w:r>
@@ -4589,7 +5290,7 @@
         <w:pStyle w:val="Compact"/>
         <w:numPr>
           <w:ilvl w:val="0"/>
-          <w:numId w:val="1030"/>
+          <w:numId w:val="1032"/>
         </w:numPr>
       </w:pPr>
       <w:r>
@@ -4607,7 +5308,7 @@
         <w:pStyle w:val="Compact"/>
         <w:numPr>
           <w:ilvl w:val="0"/>
-          <w:numId w:val="1030"/>
+          <w:numId w:val="1032"/>
         </w:numPr>
       </w:pPr>
       <w:r>
@@ -4619,7 +5320,7 @@
         <w:pStyle w:val="Compact"/>
         <w:numPr>
           <w:ilvl w:val="0"/>
-          <w:numId w:val="1030"/>
+          <w:numId w:val="1032"/>
         </w:numPr>
       </w:pPr>
       <w:r>
@@ -4679,7 +5380,7 @@
         <w:pStyle w:val="Compact"/>
         <w:numPr>
           <w:ilvl w:val="0"/>
-          <w:numId w:val="1031"/>
+          <w:numId w:val="1033"/>
         </w:numPr>
       </w:pPr>
       <w:r>
@@ -4707,7 +5408,7 @@
         <w:pStyle w:val="Compact"/>
         <w:numPr>
           <w:ilvl w:val="0"/>
-          <w:numId w:val="1031"/>
+          <w:numId w:val="1033"/>
         </w:numPr>
       </w:pPr>
       <w:r>
@@ -4719,7 +5420,7 @@
         <w:pStyle w:val="Compact"/>
         <w:numPr>
           <w:ilvl w:val="0"/>
-          <w:numId w:val="1031"/>
+          <w:numId w:val="1033"/>
         </w:numPr>
       </w:pPr>
       <w:r>
@@ -4747,7 +5448,7 @@
         <w:pStyle w:val="Compact"/>
         <w:numPr>
           <w:ilvl w:val="0"/>
-          <w:numId w:val="1031"/>
+          <w:numId w:val="1033"/>
         </w:numPr>
       </w:pPr>
       <w:r>
@@ -4759,7 +5460,7 @@
         <w:pStyle w:val="Compact"/>
         <w:numPr>
           <w:ilvl w:val="0"/>
-          <w:numId w:val="1031"/>
+          <w:numId w:val="1033"/>
         </w:numPr>
       </w:pPr>
       <w:r>
@@ -4905,9 +5606,6 @@
         <w:br/>
       </w:r>
       <w:r>
-        <w:br/>
-      </w:r>
-      <w:r>
         <w:rPr>
           <w:rStyle w:val="CommentTok"/>
         </w:rPr>
@@ -5037,9 +5735,6 @@
         <w:br/>
       </w:r>
       <w:r>
-        <w:br/>
-      </w:r>
-      <w:r>
         <w:rPr>
           <w:rStyle w:val="CommentTok"/>
         </w:rPr>
@@ -5142,7 +5837,7 @@
         <w:rPr>
           <w:rStyle w:val="DecValTok"/>
         </w:rPr>
-        <w:t xml:space="preserve">10</w:t>
+        <w:t xml:space="preserve">50</w:t>
       </w:r>
       <w:r>
         <w:rPr>
@@ -5166,9 +5861,6 @@
         <w:br/>
       </w:r>
       <w:r>
-        <w:br/>
-      </w:r>
-      <w:r>
         <w:rPr>
           <w:rStyle w:val="CommentTok"/>
         </w:rPr>
@@ -5244,7 +5936,7 @@
         <w:rPr>
           <w:rStyle w:val="DecValTok"/>
         </w:rPr>
-        <w:t xml:space="preserve">10</w:t>
+        <w:t xml:space="preserve">50</w:t>
       </w:r>
       <w:r>
         <w:rPr>
@@ -6072,85 +6764,11 @@
         <w:pStyle w:val="Compact"/>
         <w:numPr>
           <w:ilvl w:val="0"/>
-          <w:numId w:val="1032"/>
+          <w:numId w:val="1034"/>
         </w:numPr>
       </w:pPr>
       <w:r>
         <w:t xml:space="preserve">s is the sample standard deviation</w:t>
-      </w:r>
-    </w:p>
-    <w:p>
-      <w:pPr>
-        <w:pStyle w:val="Compact"/>
-        <w:numPr>
-          <w:ilvl w:val="0"/>
-          <w:numId w:val="1032"/>
-        </w:numPr>
-      </w:pPr>
-      <w:r>
-        <w:t xml:space="preserve">n is the sample size</w:t>
-      </w:r>
-    </w:p>
-    <w:p>
-      <w:pPr>
-        <w:pStyle w:val="FirstParagraph"/>
-      </w:pPr>
-      <w:r>
-        <w:t xml:space="preserve">The standard error tells us:</w:t>
-      </w:r>
-    </w:p>
-    <w:p>
-      <w:pPr>
-        <w:pStyle w:val="Compact"/>
-        <w:numPr>
-          <w:ilvl w:val="0"/>
-          <w:numId w:val="1033"/>
-        </w:numPr>
-      </w:pPr>
-      <w:r>
-        <w:t xml:space="preserve">How much uncertainty is in our estimate</w:t>
-      </w:r>
-    </w:p>
-    <w:p>
-      <w:pPr>
-        <w:pStyle w:val="Compact"/>
-        <w:numPr>
-          <w:ilvl w:val="0"/>
-          <w:numId w:val="1033"/>
-        </w:numPr>
-      </w:pPr>
-      <w:r>
-        <w:t xml:space="preserve">How much sample means are expected to vary</w:t>
-      </w:r>
-    </w:p>
-    <w:p>
-      <w:pPr>
-        <w:pStyle w:val="Compact"/>
-        <w:numPr>
-          <w:ilvl w:val="0"/>
-          <w:numId w:val="1033"/>
-        </w:numPr>
-      </w:pPr>
-      <w:r>
-        <w:t xml:space="preserve">How close our sample mean is likely to be to the true population</w:t>
-      </w:r>
-      <w:r>
-        <w:t xml:space="preserve"> </w:t>
-      </w:r>
-      <w:r>
-        <w:t xml:space="preserve">mean</w:t>
-      </w:r>
-    </w:p>
-    <w:p>
-      <w:pPr>
-        <w:pStyle w:val="FirstParagraph"/>
-      </w:pPr>
-      <w:r>
-        <w:rPr>
-          <w:b/>
-          <w:bCs/>
-        </w:rPr>
-        <w:t xml:space="preserve">Remember:</w:t>
       </w:r>
     </w:p>
     <w:p>
@@ -6162,13 +6780,15 @@
         </w:numPr>
       </w:pPr>
       <w:r>
-        <w:t xml:space="preserve">Standard deviation (s) describes the variability in the</w:t>
-      </w:r>
-      <w:r>
-        <w:t xml:space="preserve"> </w:t>
-      </w:r>
-      <w:r>
-        <w:t xml:space="preserve">individual data points</w:t>
+        <w:t xml:space="preserve">n is the sample size</w:t>
+      </w:r>
+    </w:p>
+    <w:p>
+      <w:pPr>
+        <w:pStyle w:val="FirstParagraph"/>
+      </w:pPr>
+      <w:r>
+        <w:t xml:space="preserve">The standard error tells us:</w:t>
       </w:r>
     </w:p>
     <w:p>
@@ -6176,17 +6796,11 @@
         <w:pStyle w:val="Compact"/>
         <w:numPr>
           <w:ilvl w:val="0"/>
-          <w:numId w:val="1034"/>
+          <w:numId w:val="1035"/>
         </w:numPr>
       </w:pPr>
       <w:r>
-        <w:t xml:space="preserve">Standard error (SE) describes the variability in the sample mean</w:t>
-      </w:r>
-      <w:r>
-        <w:t xml:space="preserve"> </w:t>
-      </w:r>
-      <w:r>
-        <w:t xml:space="preserve">itself</w:t>
+        <w:t xml:space="preserve">How much uncertainty is in our estimate</w:t>
       </w:r>
     </w:p>
     <w:p>
@@ -6194,7 +6808,85 @@
         <w:pStyle w:val="Compact"/>
         <w:numPr>
           <w:ilvl w:val="0"/>
-          <w:numId w:val="1034"/>
+          <w:numId w:val="1035"/>
+        </w:numPr>
+      </w:pPr>
+      <w:r>
+        <w:t xml:space="preserve">How much sample means are expected to vary</w:t>
+      </w:r>
+    </w:p>
+    <w:p>
+      <w:pPr>
+        <w:pStyle w:val="Compact"/>
+        <w:numPr>
+          <w:ilvl w:val="0"/>
+          <w:numId w:val="1035"/>
+        </w:numPr>
+      </w:pPr>
+      <w:r>
+        <w:t xml:space="preserve">How close our sample mean is likely to be to the true population</w:t>
+      </w:r>
+      <w:r>
+        <w:t xml:space="preserve"> </w:t>
+      </w:r>
+      <w:r>
+        <w:t xml:space="preserve">mean</w:t>
+      </w:r>
+    </w:p>
+    <w:p>
+      <w:pPr>
+        <w:pStyle w:val="FirstParagraph"/>
+      </w:pPr>
+      <w:r>
+        <w:rPr>
+          <w:b/>
+          <w:bCs/>
+        </w:rPr>
+        <w:t xml:space="preserve">Remember:</w:t>
+      </w:r>
+    </w:p>
+    <w:p>
+      <w:pPr>
+        <w:pStyle w:val="Compact"/>
+        <w:numPr>
+          <w:ilvl w:val="0"/>
+          <w:numId w:val="1036"/>
+        </w:numPr>
+      </w:pPr>
+      <w:r>
+        <w:t xml:space="preserve">Standard deviation (s) describes the variability in the individual</w:t>
+      </w:r>
+      <w:r>
+        <w:t xml:space="preserve"> </w:t>
+      </w:r>
+      <w:r>
+        <w:t xml:space="preserve">data points</w:t>
+      </w:r>
+    </w:p>
+    <w:p>
+      <w:pPr>
+        <w:pStyle w:val="Compact"/>
+        <w:numPr>
+          <w:ilvl w:val="0"/>
+          <w:numId w:val="1036"/>
+        </w:numPr>
+      </w:pPr>
+      <w:r>
+        <w:t xml:space="preserve">Standard error (SE) describes the variability in the sample mean</w:t>
+      </w:r>
+      <w:r>
+        <w:t xml:space="preserve"> </w:t>
+      </w:r>
+      <w:r>
+        <w:t xml:space="preserve">itself</w:t>
+      </w:r>
+    </w:p>
+    <w:p>
+      <w:pPr>
+        <w:pStyle w:val="Compact"/>
+        <w:numPr>
+          <w:ilvl w:val="0"/>
+          <w:numId w:val="1036"/>
         </w:numPr>
       </w:pPr>
       <w:r>
@@ -6654,7 +7346,7 @@
         <w:pStyle w:val="Compact"/>
         <w:numPr>
           <w:ilvl w:val="0"/>
-          <w:numId w:val="1035"/>
+          <w:numId w:val="1037"/>
         </w:numPr>
       </w:pPr>
       <w:r>
@@ -6666,7 +7358,7 @@
         <w:pStyle w:val="Compact"/>
         <w:numPr>
           <w:ilvl w:val="0"/>
-          <w:numId w:val="1035"/>
+          <w:numId w:val="1037"/>
         </w:numPr>
       </w:pPr>
       <w:r>
@@ -6678,7 +7370,7 @@
         <w:pStyle w:val="Compact"/>
         <w:numPr>
           <w:ilvl w:val="0"/>
-          <w:numId w:val="1035"/>
+          <w:numId w:val="1037"/>
         </w:numPr>
       </w:pPr>
       <w:r>
@@ -6704,7 +7396,7 @@
         <w:pStyle w:val="Compact"/>
         <w:numPr>
           <w:ilvl w:val="0"/>
-          <w:numId w:val="1036"/>
+          <w:numId w:val="1038"/>
         </w:numPr>
       </w:pPr>
       <w:r>
@@ -6716,7 +7408,7 @@
         <w:pStyle w:val="Compact"/>
         <w:numPr>
           <w:ilvl w:val="0"/>
-          <w:numId w:val="1036"/>
+          <w:numId w:val="1038"/>
         </w:numPr>
       </w:pPr>
       <w:r>
@@ -6728,7 +7420,7 @@
         <w:pStyle w:val="Compact"/>
         <w:numPr>
           <w:ilvl w:val="0"/>
-          <w:numId w:val="1036"/>
+          <w:numId w:val="1038"/>
         </w:numPr>
       </w:pPr>
       <w:r>
@@ -7890,7 +8582,7 @@
         <w:pStyle w:val="Compact"/>
         <w:numPr>
           <w:ilvl w:val="0"/>
-          <w:numId w:val="1037"/>
+          <w:numId w:val="1039"/>
         </w:numPr>
       </w:pPr>
       <w:r>
@@ -7902,7 +8594,7 @@
         <w:pStyle w:val="Compact"/>
         <w:numPr>
           <w:ilvl w:val="0"/>
-          <w:numId w:val="1037"/>
+          <w:numId w:val="1039"/>
         </w:numPr>
       </w:pPr>
       <w:r>
@@ -7914,7 +8606,7 @@
         <w:pStyle w:val="Compact"/>
         <w:numPr>
           <w:ilvl w:val="0"/>
-          <w:numId w:val="1037"/>
+          <w:numId w:val="1039"/>
         </w:numPr>
       </w:pPr>
       <w:r>
@@ -8680,7 +9372,7 @@
         <w:pStyle w:val="Compact"/>
         <w:numPr>
           <w:ilvl w:val="0"/>
-          <w:numId w:val="1038"/>
+          <w:numId w:val="1040"/>
         </w:numPr>
       </w:pPr>
       <w:r>
@@ -8698,17 +9390,17 @@
         <w:pStyle w:val="Compact"/>
         <w:numPr>
           <w:ilvl w:val="0"/>
-          <w:numId w:val="1038"/>
+          <w:numId w:val="1040"/>
         </w:numPr>
       </w:pPr>
       <w:r>
-        <w:t xml:space="preserve">About 95% of such intervals constructed from different samples</w:t>
-      </w:r>
-      <w:r>
-        <w:t xml:space="preserve"> </w:t>
-      </w:r>
-      <w:r>
-        <w:t xml:space="preserve">would contain the true population mean</w:t>
+        <w:t xml:space="preserve">About 95% of such intervals constructed from different samples would</w:t>
+      </w:r>
+      <w:r>
+        <w:t xml:space="preserve"> </w:t>
+      </w:r>
+      <w:r>
+        <w:t xml:space="preserve">contain the true population mean</w:t>
       </w:r>
     </w:p>
     <w:p>
@@ -11131,7 +11823,7 @@
         <w:pStyle w:val="Compact"/>
         <w:numPr>
           <w:ilvl w:val="0"/>
-          <w:numId w:val="1039"/>
+          <w:numId w:val="1041"/>
         </w:numPr>
       </w:pPr>
       <w:r>
@@ -11165,7 +11857,7 @@
         <w:pStyle w:val="Compact"/>
         <w:numPr>
           <w:ilvl w:val="0"/>
-          <w:numId w:val="1039"/>
+          <w:numId w:val="1041"/>
         </w:numPr>
       </w:pPr>
       <w:r>
@@ -11233,7 +11925,7 @@
         <w:pStyle w:val="Compact"/>
         <w:numPr>
           <w:ilvl w:val="0"/>
-          <w:numId w:val="1039"/>
+          <w:numId w:val="1041"/>
         </w:numPr>
       </w:pPr>
       <w:r>
@@ -11260,82 +11952,6 @@
       </w:r>
       <w:r>
         <w:t xml:space="preserve">statistics that would be expected due to random sampling</w:t>
-      </w:r>
-    </w:p>
-    <w:p>
-      <w:pPr>
-        <w:pStyle w:val="Compact"/>
-        <w:numPr>
-          <w:ilvl w:val="0"/>
-          <w:numId w:val="1039"/>
-        </w:numPr>
-      </w:pPr>
-      <w:r>
-        <w:rPr>
-          <w:b/>
-          <w:bCs/>
-        </w:rPr>
-        <w:t xml:space="preserve">Confidence intervals</w:t>
-      </w:r>
-      <w:r>
-        <w:t xml:space="preserve"> </w:t>
-      </w:r>
-      <w:r>
-        <w:t xml:space="preserve">provide a range of plausible values for the</w:t>
-      </w:r>
-      <w:r>
-        <w:t xml:space="preserve"> </w:t>
-      </w:r>
-      <w:r>
-        <w:t xml:space="preserve">population parameter</w:t>
-      </w:r>
-    </w:p>
-    <w:p>
-      <w:pPr>
-        <w:pStyle w:val="Compact"/>
-        <w:numPr>
-          <w:ilvl w:val="0"/>
-          <w:numId w:val="1039"/>
-        </w:numPr>
-      </w:pPr>
-      <w:r>
-        <w:t xml:space="preserve">Larger sample sizes provide more precise estimates (narrower</w:t>
-      </w:r>
-      <w:r>
-        <w:t xml:space="preserve"> </w:t>
-      </w:r>
-      <w:r>
-        <w:t xml:space="preserve">confidence intervals)</w:t>
-      </w:r>
-    </w:p>
-    <w:p>
-      <w:pPr>
-        <w:pStyle w:val="Compact"/>
-        <w:numPr>
-          <w:ilvl w:val="0"/>
-          <w:numId w:val="1039"/>
-        </w:numPr>
-      </w:pPr>
-      <w:r>
-        <w:t xml:space="preserve">When reporting results, always include a measure of precision (SE or</w:t>
-      </w:r>
-    </w:p>
-    <w:bookmarkEnd w:id="137"/>
-    <w:bookmarkStart w:id="138" w:name="lecture-3-conclusion"/>
-    <w:p>
-      <w:pPr>
-        <w:pStyle w:val="Heading1"/>
-      </w:pPr>
-      <w:r>
-        <w:t xml:space="preserve">Lecture 3: Conclusion</w:t>
-      </w:r>
-    </w:p>
-    <w:p>
-      <w:pPr>
-        <w:pStyle w:val="FirstParagraph"/>
-      </w:pPr>
-      <w:r>
-        <w:t xml:space="preserve">In this lecture, we’ve explored:</w:t>
       </w:r>
     </w:p>
     <w:p>
@@ -11347,7 +11963,23 @@
         </w:numPr>
       </w:pPr>
       <w:r>
-        <w:t xml:space="preserve">Why statistics is essential in biology</w:t>
+        <w:rPr>
+          <w:b/>
+          <w:bCs/>
+        </w:rPr>
+        <w:t xml:space="preserve">Confidence intervals</w:t>
+      </w:r>
+      <w:r>
+        <w:t xml:space="preserve"> </w:t>
+      </w:r>
+      <w:r>
+        <w:t xml:space="preserve">provide a range of plausible values for the</w:t>
+      </w:r>
+      <w:r>
+        <w:t xml:space="preserve"> </w:t>
+      </w:r>
+      <w:r>
+        <w:t xml:space="preserve">population parameter</w:t>
       </w:r>
     </w:p>
     <w:p>
@@ -11359,7 +11991,13 @@
         </w:numPr>
       </w:pPr>
       <w:r>
-        <w:t xml:space="preserve">Types of biological variables and their properties</w:t>
+        <w:t xml:space="preserve">Larger sample sizes provide more precise estimates (narrower</w:t>
+      </w:r>
+      <w:r>
+        <w:t xml:space="preserve"> </w:t>
+      </w:r>
+      <w:r>
+        <w:t xml:space="preserve">confidence intervals)</w:t>
       </w:r>
     </w:p>
     <w:p>
@@ -11371,7 +12009,25 @@
         </w:numPr>
       </w:pPr>
       <w:r>
-        <w:t xml:space="preserve">Accuracy, precision, and bias in measurements</w:t>
+        <w:t xml:space="preserve">When reporting results, always include a measure of precision (SE or</w:t>
+      </w:r>
+    </w:p>
+    <w:bookmarkEnd w:id="137"/>
+    <w:bookmarkStart w:id="138" w:name="lecture-3-conclusion"/>
+    <w:p>
+      <w:pPr>
+        <w:pStyle w:val="Heading1"/>
+      </w:pPr>
+      <w:r>
+        <w:t xml:space="preserve">Lecture 3: Conclusion</w:t>
+      </w:r>
+    </w:p>
+    <w:p>
+      <w:pPr>
+        <w:pStyle w:val="FirstParagraph"/>
+      </w:pPr>
+      <w:r>
+        <w:t xml:space="preserve">In this lecture, we’ve explored:</w:t>
       </w:r>
     </w:p>
     <w:p>
@@ -11379,11 +12035,11 @@
         <w:pStyle w:val="Compact"/>
         <w:numPr>
           <w:ilvl w:val="0"/>
-          <w:numId w:val="1041"/>
+          <w:numId w:val="1043"/>
         </w:numPr>
       </w:pPr>
       <w:r>
-        <w:t xml:space="preserve">Measures of central tendency (mean, median, geometric mean)</w:t>
+        <w:t xml:space="preserve">Why statistics is essential in biology</w:t>
       </w:r>
     </w:p>
     <w:p>
@@ -11391,17 +12047,11 @@
         <w:pStyle w:val="Compact"/>
         <w:numPr>
           <w:ilvl w:val="0"/>
-          <w:numId w:val="1041"/>
+          <w:numId w:val="1043"/>
         </w:numPr>
       </w:pPr>
       <w:r>
-        <w:t xml:space="preserve">Measures of spread (standard deviation, variance, and interquartile</w:t>
-      </w:r>
-      <w:r>
-        <w:t xml:space="preserve"> </w:t>
-      </w:r>
-      <w:r>
-        <w:t xml:space="preserve">range)</w:t>
+        <w:t xml:space="preserve">Types of biological variables and their properties</w:t>
       </w:r>
     </w:p>
     <w:p>
@@ -11409,11 +12059,11 @@
         <w:pStyle w:val="Compact"/>
         <w:numPr>
           <w:ilvl w:val="0"/>
-          <w:numId w:val="1041"/>
+          <w:numId w:val="1043"/>
         </w:numPr>
       </w:pPr>
       <w:r>
-        <w:t xml:space="preserve">Data transformations for skewed distributions</w:t>
+        <w:t xml:space="preserve">Accuracy, precision, and bias in measurements</w:t>
       </w:r>
     </w:p>
     <w:p>
@@ -11421,11 +12071,11 @@
         <w:pStyle w:val="Compact"/>
         <w:numPr>
           <w:ilvl w:val="0"/>
-          <w:numId w:val="1041"/>
+          <w:numId w:val="1043"/>
         </w:numPr>
       </w:pPr>
       <w:r>
-        <w:t xml:space="preserve">Visualization techniques for understanding distributions</w:t>
+        <w:t xml:space="preserve">Measures of central tendency (mean, median, geometric mean)</w:t>
       </w:r>
     </w:p>
     <w:p>
@@ -11433,7 +12083,49 @@
         <w:pStyle w:val="Compact"/>
         <w:numPr>
           <w:ilvl w:val="0"/>
-          <w:numId w:val="1041"/>
+          <w:numId w:val="1043"/>
+        </w:numPr>
+      </w:pPr>
+      <w:r>
+        <w:t xml:space="preserve">Measures of spread (standard deviation, variance, and interquartile</w:t>
+      </w:r>
+      <w:r>
+        <w:t xml:space="preserve"> </w:t>
+      </w:r>
+      <w:r>
+        <w:t xml:space="preserve">range)</w:t>
+      </w:r>
+    </w:p>
+    <w:p>
+      <w:pPr>
+        <w:pStyle w:val="Compact"/>
+        <w:numPr>
+          <w:ilvl w:val="0"/>
+          <w:numId w:val="1043"/>
+        </w:numPr>
+      </w:pPr>
+      <w:r>
+        <w:t xml:space="preserve">Data transformations for skewed distributions</w:t>
+      </w:r>
+    </w:p>
+    <w:p>
+      <w:pPr>
+        <w:pStyle w:val="Compact"/>
+        <w:numPr>
+          <w:ilvl w:val="0"/>
+          <w:numId w:val="1043"/>
+        </w:numPr>
+      </w:pPr>
+      <w:r>
+        <w:t xml:space="preserve">Visualization techniques for understanding distributions</w:t>
+      </w:r>
+    </w:p>
+    <w:p>
+      <w:pPr>
+        <w:pStyle w:val="Compact"/>
+        <w:numPr>
+          <w:ilvl w:val="0"/>
+          <w:numId w:val="1043"/>
         </w:numPr>
       </w:pPr>
       <w:r>
@@ -11864,34 +12556,7 @@
     <w:abstractNumId w:val="991"/>
   </w:num>
   <w:num w:numId="1008">
-    <w:abstractNumId w:val="99411"/>
-    <w:lvlOverride w:ilvl="0">
-      <w:startOverride w:val="1"/>
-    </w:lvlOverride>
-    <w:lvlOverride w:ilvl="1">
-      <w:startOverride w:val="1"/>
-    </w:lvlOverride>
-    <w:lvlOverride w:ilvl="2">
-      <w:startOverride w:val="1"/>
-    </w:lvlOverride>
-    <w:lvlOverride w:ilvl="3">
-      <w:startOverride w:val="1"/>
-    </w:lvlOverride>
-    <w:lvlOverride w:ilvl="4">
-      <w:startOverride w:val="1"/>
-    </w:lvlOverride>
-    <w:lvlOverride w:ilvl="5">
-      <w:startOverride w:val="1"/>
-    </w:lvlOverride>
-    <w:lvlOverride w:ilvl="6">
-      <w:startOverride w:val="1"/>
-    </w:lvlOverride>
-    <w:lvlOverride w:ilvl="7">
-      <w:startOverride w:val="1"/>
-    </w:lvlOverride>
-    <w:lvlOverride w:ilvl="8">
-      <w:startOverride w:val="1"/>
-    </w:lvlOverride>
+    <w:abstractNumId w:val="991"/>
   </w:num>
   <w:num w:numId="1009">
     <w:abstractNumId w:val="991"/>
@@ -11921,7 +12586,34 @@
     <w:abstractNumId w:val="991"/>
   </w:num>
   <w:num w:numId="1018">
-    <w:abstractNumId w:val="991"/>
+    <w:abstractNumId w:val="99411"/>
+    <w:lvlOverride w:ilvl="0">
+      <w:startOverride w:val="1"/>
+    </w:lvlOverride>
+    <w:lvlOverride w:ilvl="1">
+      <w:startOverride w:val="1"/>
+    </w:lvlOverride>
+    <w:lvlOverride w:ilvl="2">
+      <w:startOverride w:val="1"/>
+    </w:lvlOverride>
+    <w:lvlOverride w:ilvl="3">
+      <w:startOverride w:val="1"/>
+    </w:lvlOverride>
+    <w:lvlOverride w:ilvl="4">
+      <w:startOverride w:val="1"/>
+    </w:lvlOverride>
+    <w:lvlOverride w:ilvl="5">
+      <w:startOverride w:val="1"/>
+    </w:lvlOverride>
+    <w:lvlOverride w:ilvl="6">
+      <w:startOverride w:val="1"/>
+    </w:lvlOverride>
+    <w:lvlOverride w:ilvl="7">
+      <w:startOverride w:val="1"/>
+    </w:lvlOverride>
+    <w:lvlOverride w:ilvl="8">
+      <w:startOverride w:val="1"/>
+    </w:lvlOverride>
   </w:num>
   <w:num w:numId="1019">
     <w:abstractNumId w:val="991"/>
@@ -11957,6 +12649,12 @@
     <w:abstractNumId w:val="991"/>
   </w:num>
   <w:num w:numId="1030">
+    <w:abstractNumId w:val="991"/>
+  </w:num>
+  <w:num w:numId="1031">
+    <w:abstractNumId w:val="991"/>
+  </w:num>
+  <w:num w:numId="1032">
     <w:abstractNumId w:val="99411"/>
     <w:lvlOverride w:ilvl="0">
       <w:startOverride w:val="1"/>
@@ -11986,12 +12684,6 @@
       <w:startOverride w:val="1"/>
     </w:lvlOverride>
   </w:num>
-  <w:num w:numId="1031">
-    <w:abstractNumId w:val="991"/>
-  </w:num>
-  <w:num w:numId="1032">
-    <w:abstractNumId w:val="991"/>
-  </w:num>
   <w:num w:numId="1033">
     <w:abstractNumId w:val="991"/>
   </w:num>
@@ -11999,34 +12691,7 @@
     <w:abstractNumId w:val="991"/>
   </w:num>
   <w:num w:numId="1035">
-    <w:abstractNumId w:val="99411"/>
-    <w:lvlOverride w:ilvl="0">
-      <w:startOverride w:val="1"/>
-    </w:lvlOverride>
-    <w:lvlOverride w:ilvl="1">
-      <w:startOverride w:val="1"/>
-    </w:lvlOverride>
-    <w:lvlOverride w:ilvl="2">
-      <w:startOverride w:val="1"/>
-    </w:lvlOverride>
-    <w:lvlOverride w:ilvl="3">
-      <w:startOverride w:val="1"/>
-    </w:lvlOverride>
-    <w:lvlOverride w:ilvl="4">
-      <w:startOverride w:val="1"/>
-    </w:lvlOverride>
-    <w:lvlOverride w:ilvl="5">
-      <w:startOverride w:val="1"/>
-    </w:lvlOverride>
-    <w:lvlOverride w:ilvl="6">
-      <w:startOverride w:val="1"/>
-    </w:lvlOverride>
-    <w:lvlOverride w:ilvl="7">
-      <w:startOverride w:val="1"/>
-    </w:lvlOverride>
-    <w:lvlOverride w:ilvl="8">
-      <w:startOverride w:val="1"/>
-    </w:lvlOverride>
+    <w:abstractNumId w:val="991"/>
   </w:num>
   <w:num w:numId="1036">
     <w:abstractNumId w:val="991"/>
@@ -12065,9 +12730,42 @@
     <w:abstractNumId w:val="991"/>
   </w:num>
   <w:num w:numId="1039">
+    <w:abstractNumId w:val="99411"/>
+    <w:lvlOverride w:ilvl="0">
+      <w:startOverride w:val="1"/>
+    </w:lvlOverride>
+    <w:lvlOverride w:ilvl="1">
+      <w:startOverride w:val="1"/>
+    </w:lvlOverride>
+    <w:lvlOverride w:ilvl="2">
+      <w:startOverride w:val="1"/>
+    </w:lvlOverride>
+    <w:lvlOverride w:ilvl="3">
+      <w:startOverride w:val="1"/>
+    </w:lvlOverride>
+    <w:lvlOverride w:ilvl="4">
+      <w:startOverride w:val="1"/>
+    </w:lvlOverride>
+    <w:lvlOverride w:ilvl="5">
+      <w:startOverride w:val="1"/>
+    </w:lvlOverride>
+    <w:lvlOverride w:ilvl="6">
+      <w:startOverride w:val="1"/>
+    </w:lvlOverride>
+    <w:lvlOverride w:ilvl="7">
+      <w:startOverride w:val="1"/>
+    </w:lvlOverride>
+    <w:lvlOverride w:ilvl="8">
+      <w:startOverride w:val="1"/>
+    </w:lvlOverride>
+  </w:num>
+  <w:num w:numId="1040">
     <w:abstractNumId w:val="991"/>
   </w:num>
-  <w:num w:numId="1040">
+  <w:num w:numId="1041">
+    <w:abstractNumId w:val="991"/>
+  </w:num>
+  <w:num w:numId="1042">
     <w:abstractNumId w:val="9962101"/>
     <w:lvlOverride w:ilvl="0">
       <w:startOverride w:val="101"/>
@@ -12097,7 +12795,7 @@
       <w:startOverride w:val="101"/>
     </w:lvlOverride>
   </w:num>
-  <w:num w:numId="1041">
+  <w:num w:numId="1043">
     <w:abstractNumId w:val="991"/>
   </w:num>
 </w:numbering>

</xml_diff>